<commit_message>
Created WBS and Gantt chart
</commit_message>
<xml_diff>
--- a/Platform_SRS_v1.0.docx
+++ b/Platform_SRS_v1.0.docx
@@ -100,7 +100,10 @@
     </w:p>
     <w:p>
       <w:r>
-        <w:t>This Software Requirements Specification (SRS) defines the initial requirements for the Smart Parking Platform. Its structure follows the SRS format presented in Lecture 2: Introduction, Overall Description, Functional Requirements, Non-Functional Requirements, and Use Cases. The assigned semester project establishes the core capabilities of the platform, including real-time parking availability, maps, reservations, digital payments, notifications, operator tools, analytics, and third-party navigation integration. Additional draft requirements in this version reflect initial project research and requirements elicitation and may be refined as stakeholder analysis continues.</w:t>
+        <w:t>This Software Requirements Specification (SRS) defines the initial requirements for the Smart Parking Platform. Its structure follows the SRS format presented in Lecture 2: Introduction, Overall Description, Functional Requirements, Non-Functional Requirements, and Use Cases. The assigned semester project establishes the core capabilities of the platform, including real-time parking availability, maps, reservations, digital payments, notifications, operator tools, analytics, and third-party navigation integ</w:t>
+      </w:r>
+      <w:r>
+        <w:t>ration. Additional draft requirements in this version reflect initial project research and requirements elicitation and may be refined as stakeholder analysis continues.</w:t>
       </w:r>
     </w:p>
     <w:p>
@@ -3578,6 +3581,16 @@
               <w:t>FR-09, FR-12, FR-13</w:t>
             </w:r>
           </w:p>
+          <w:p>
+            <w:pPr>
+              <w:tabs>
+                <w:tab w:val="left" w:pos="960"/>
+              </w:tabs>
+            </w:pPr>
+            <w:r>
+              <w:tab/>
+            </w:r>
+          </w:p>
         </w:tc>
         <w:tc>
           <w:tcPr>
@@ -3777,9 +3790,278 @@
       </w:tr>
     </w:tbl>
     <w:p/>
+    <w:p>
+      <w:r>
+        <w:br w:type="page"/>
+      </w:r>
+    </w:p>
+    <w:bookmarkStart w:id="0" w:name="_MON_1851178965"/>
+    <w:bookmarkEnd w:id="0"/>
+    <w:p>
+      <w:pPr>
+        <w:spacing w:line="240" w:lineRule="auto"/>
+        <w:jc w:val="center"/>
+      </w:pPr>
+      <w:r>
+        <w:rPr>
+          <w:b/>
+          <w:bCs/>
+          <w:sz w:val="28"/>
+          <w:szCs w:val="28"/>
+        </w:rPr>
+        <w:object w:dxaOrig="10619" w:dyaOrig="566" w14:anchorId="00AE9FE4">
+          <v:shapetype id="_x0000_t75" coordsize="21600,21600" o:spt="75" o:preferrelative="t" path="m@4@5l@4@11@9@11@9@5xe" filled="f" stroked="f">
+            <v:stroke joinstyle="miter"/>
+            <v:formulas>
+              <v:f eqn="if lineDrawn pixelLineWidth 0"/>
+              <v:f eqn="sum @0 1 0"/>
+              <v:f eqn="sum 0 0 @1"/>
+              <v:f eqn="prod @2 1 2"/>
+              <v:f eqn="prod @3 21600 pixelWidth"/>
+              <v:f eqn="prod @3 21600 pixelHeight"/>
+              <v:f eqn="sum @0 0 1"/>
+              <v:f eqn="prod @6 1 2"/>
+              <v:f eqn="prod @7 21600 pixelWidth"/>
+              <v:f eqn="sum @8 21600 0"/>
+              <v:f eqn="prod @7 21600 pixelHeight"/>
+              <v:f eqn="sum @10 21600 0"/>
+            </v:formulas>
+            <v:path o:extrusionok="f" gradientshapeok="t" o:connecttype="rect"/>
+            <o:lock v:ext="edit" aspectratio="t"/>
+          </v:shapetype>
+          <v:shape id="_x0000_i1025" type="#_x0000_t75" style="width:531pt;height:28.5pt" o:ole="">
+            <v:imagedata r:id="rId8" o:title=""/>
+          </v:shape>
+          <o:OLEObject Type="Embed" ProgID="Word.Document.12" ShapeID="_x0000_i1025" DrawAspect="Content" ObjectID="_1851183312" r:id="rId9">
+            <o:FieldCodes>\s</o:FieldCodes>
+          </o:OLEObject>
+        </w:object>
+      </w:r>
+      <w:r>
+        <w:rPr>
+          <w:b/>
+          <w:sz w:val="40"/>
+        </w:rPr>
+        <w:t>Smart Parking Platform</w:t>
+      </w:r>
+    </w:p>
+    <w:p>
+      <w:pPr>
+        <w:spacing w:line="240" w:lineRule="auto"/>
+        <w:jc w:val="center"/>
+      </w:pPr>
+      <w:r>
+        <w:rPr>
+          <w:b/>
+          <w:sz w:val="28"/>
+        </w:rPr>
+        <w:t>Work Breakdown Structure (WBS)</w:t>
+      </w:r>
+    </w:p>
+    <w:p>
+      <w:pPr>
+        <w:spacing w:line="240" w:lineRule="auto"/>
+        <w:jc w:val="center"/>
+      </w:pPr>
+      <w:r>
+        <w:rPr>
+          <w:sz w:val="20"/>
+        </w:rPr>
+        <w:t>Carlo Sosa | CIS 4374| Homework 2</w:t>
+      </w:r>
+    </w:p>
+    <w:p>
+      <w:pPr>
+        <w:jc w:val="center"/>
+      </w:pPr>
+      <w:r>
+        <w:rPr>
+          <w:noProof/>
+        </w:rPr>
+        <w:drawing>
+          <wp:inline distT="0" distB="0" distL="0" distR="0" wp14:anchorId="7CF37A7E" wp14:editId="6ED27505">
+            <wp:extent cx="6638390" cy="2838450"/>
+            <wp:effectExtent l="0" t="0" r="0" b="0"/>
+            <wp:docPr id="1" name="Picture 1"/>
+            <wp:cNvGraphicFramePr>
+              <a:graphicFrameLocks xmlns:a="http://schemas.openxmlformats.org/drawingml/2006/main" noChangeAspect="1"/>
+            </wp:cNvGraphicFramePr>
+            <a:graphic xmlns:a="http://schemas.openxmlformats.org/drawingml/2006/main">
+              <a:graphicData uri="http://schemas.openxmlformats.org/drawingml/2006/picture">
+                <pic:pic xmlns:pic="http://schemas.openxmlformats.org/drawingml/2006/picture">
+                  <pic:nvPicPr>
+                    <pic:cNvPr id="0" name="wide_clean_infographic_diagram_on_a_white_backgrou.png"/>
+                    <pic:cNvPicPr/>
+                  </pic:nvPicPr>
+                  <pic:blipFill>
+                    <a:blip r:embed="rId10"/>
+                    <a:stretch>
+                      <a:fillRect/>
+                    </a:stretch>
+                  </pic:blipFill>
+                  <pic:spPr>
+                    <a:xfrm>
+                      <a:off x="0" y="0"/>
+                      <a:ext cx="6672122" cy="2852873"/>
+                    </a:xfrm>
+                    <a:prstGeom prst="rect">
+                      <a:avLst/>
+                    </a:prstGeom>
+                  </pic:spPr>
+                </pic:pic>
+              </a:graphicData>
+            </a:graphic>
+          </wp:inline>
+        </w:drawing>
+      </w:r>
+    </w:p>
+    <w:p>
+      <w:pPr>
+        <w:jc w:val="center"/>
+        <w:rPr>
+          <w:i/>
+          <w:sz w:val="18"/>
+        </w:rPr>
+      </w:pPr>
+      <w:r>
+        <w:rPr>
+          <w:i/>
+          <w:sz w:val="18"/>
+        </w:rPr>
+        <w:t>Figure 1. Smart Parking Platform Work Breakdown Structure</w:t>
+      </w:r>
+    </w:p>
+    <w:p>
+      <w:pPr>
+        <w:jc w:val="center"/>
+        <w:rPr>
+          <w:i/>
+          <w:sz w:val="18"/>
+        </w:rPr>
+      </w:pPr>
+    </w:p>
+    <w:p>
+      <w:pPr>
+        <w:jc w:val="center"/>
+        <w:rPr>
+          <w:b/>
+          <w:bCs/>
+          <w:iCs/>
+          <w:sz w:val="28"/>
+          <w:szCs w:val="28"/>
+        </w:rPr>
+      </w:pPr>
+      <w:r>
+        <w:rPr>
+          <w:b/>
+          <w:bCs/>
+          <w:iCs/>
+          <w:sz w:val="28"/>
+          <w:szCs w:val="28"/>
+        </w:rPr>
+        <w:t>Smart Parking Platform Gantt Chart</w:t>
+      </w:r>
+    </w:p>
+    <w:p>
+      <w:pPr>
+        <w:rPr>
+          <w:b/>
+          <w:bCs/>
+          <w:sz w:val="28"/>
+          <w:szCs w:val="28"/>
+        </w:rPr>
+      </w:pPr>
+      <w:r>
+        <w:rPr>
+          <w:b/>
+          <w:bCs/>
+          <w:noProof/>
+          <w:sz w:val="28"/>
+          <w:szCs w:val="28"/>
+        </w:rPr>
+        <w:drawing>
+          <wp:inline distT="0" distB="0" distL="0" distR="0" wp14:anchorId="3C9E6AD8" wp14:editId="6F8376FC">
+            <wp:extent cx="6217920" cy="2814955"/>
+            <wp:effectExtent l="0" t="0" r="0" b="4445"/>
+            <wp:docPr id="1113334369" name="Picture 3"/>
+            <wp:cNvGraphicFramePr>
+              <a:graphicFrameLocks xmlns:a="http://schemas.openxmlformats.org/drawingml/2006/main" noChangeAspect="1"/>
+            </wp:cNvGraphicFramePr>
+            <a:graphic xmlns:a="http://schemas.openxmlformats.org/drawingml/2006/main">
+              <a:graphicData uri="http://schemas.openxmlformats.org/drawingml/2006/picture">
+                <pic:pic xmlns:pic="http://schemas.openxmlformats.org/drawingml/2006/picture">
+                  <pic:nvPicPr>
+                    <pic:cNvPr id="0" name="Picture 7"/>
+                    <pic:cNvPicPr>
+                      <a:picLocks noChangeAspect="1" noChangeArrowheads="1"/>
+                    </pic:cNvPicPr>
+                  </pic:nvPicPr>
+                  <pic:blipFill>
+                    <a:blip r:embed="rId11">
+                      <a:extLst>
+                        <a:ext uri="{28A0092B-C50C-407E-A947-70E740481C1C}">
+                          <a14:useLocalDpi xmlns:a14="http://schemas.microsoft.com/office/drawing/2010/main" val="0"/>
+                        </a:ext>
+                      </a:extLst>
+                    </a:blip>
+                    <a:srcRect/>
+                    <a:stretch>
+                      <a:fillRect/>
+                    </a:stretch>
+                  </pic:blipFill>
+                  <pic:spPr bwMode="auto">
+                    <a:xfrm>
+                      <a:off x="0" y="0"/>
+                      <a:ext cx="6217920" cy="2814955"/>
+                    </a:xfrm>
+                    <a:prstGeom prst="rect">
+                      <a:avLst/>
+                    </a:prstGeom>
+                    <a:noFill/>
+                    <a:ln>
+                      <a:noFill/>
+                    </a:ln>
+                  </pic:spPr>
+                </pic:pic>
+              </a:graphicData>
+            </a:graphic>
+          </wp:inline>
+        </w:drawing>
+      </w:r>
+    </w:p>
+    <w:p>
+      <w:pPr>
+        <w:jc w:val="center"/>
+        <w:rPr>
+          <w:i/>
+          <w:sz w:val="18"/>
+        </w:rPr>
+      </w:pPr>
+      <w:r>
+        <w:rPr>
+          <w:i/>
+          <w:sz w:val="18"/>
+        </w:rPr>
+        <w:t>Figure</w:t>
+      </w:r>
+      <w:r>
+        <w:rPr>
+          <w:i/>
+          <w:sz w:val="18"/>
+        </w:rPr>
+        <w:t xml:space="preserve"> 2</w:t>
+      </w:r>
+      <w:r>
+        <w:rPr>
+          <w:i/>
+          <w:sz w:val="18"/>
+        </w:rPr>
+        <w:t>. Smart Parking Platform Gantt Chart</w:t>
+      </w:r>
+    </w:p>
     <w:sectPr>
-      <w:headerReference w:type="default" r:id="rId8"/>
-      <w:footerReference w:type="default" r:id="rId9"/>
+      <w:headerReference w:type="default" r:id="rId12"/>
+      <w:footerReference w:type="default" r:id="rId13"/>
       <w:pgSz w:w="12240" w:h="15840"/>
       <w:pgMar w:top="1080" w:right="1224" w:bottom="1080" w:left="1224" w:header="720" w:footer="720" w:gutter="0"/>
       <w:cols w:space="720"/>
@@ -3825,35 +4107,45 @@
       <w:rPr>
         <w:sz w:val="16"/>
       </w:rPr>
-      <w:t xml:space="preserve">CIS 4374 / TLIM </w:t>
+      <w:t>CIS 4374</w:t>
+    </w:r>
+    <w:r>
+      <w:rPr>
+        <w:sz w:val="16"/>
+      </w:rPr>
+      <w:t xml:space="preserve"> | </w:t>
+    </w:r>
+    <w:r>
+      <w:rPr>
+        <w:sz w:val="16"/>
+      </w:rPr>
+      <w:t xml:space="preserve">September 10, </w:t>
     </w:r>
     <w:proofErr w:type="gramStart"/>
     <w:r>
       <w:rPr>
         <w:sz w:val="16"/>
       </w:rPr>
-      <w:t>3355  |</w:t>
+      <w:t>2026</w:t>
     </w:r>
     <w:proofErr w:type="gramEnd"/>
     <w:r>
       <w:rPr>
         <w:sz w:val="16"/>
       </w:rPr>
-      <w:t xml:space="preserve">  September 10, </w:t>
+      <w:t xml:space="preserve"> </w:t>
     </w:r>
-    <w:proofErr w:type="gramStart"/>
     <w:r>
       <w:rPr>
         <w:sz w:val="16"/>
       </w:rPr>
-      <w:t>2026  |</w:t>
+      <w:t xml:space="preserve">| </w:t>
     </w:r>
-    <w:proofErr w:type="gramEnd"/>
     <w:r>
       <w:rPr>
         <w:sz w:val="16"/>
       </w:rPr>
-      <w:t xml:space="preserve">  Page </w:t>
+      <w:t xml:space="preserve">Page </w:t>
     </w:r>
     <w:r>
       <w:fldChar w:fldCharType="begin"/>
@@ -3941,7 +4233,19 @@
       <w:rPr>
         <w:sz w:val="16"/>
       </w:rPr>
-      <w:t>. | Smart Parking Platform | SRS v1.0</w:t>
+      <w:t>. | Smart Parking Platform | SRS v</w:t>
+    </w:r>
+    <w:r>
+      <w:rPr>
+        <w:sz w:val="16"/>
+      </w:rPr>
+      <w:t>2</w:t>
+    </w:r>
+    <w:r>
+      <w:rPr>
+        <w:sz w:val="16"/>
+      </w:rPr>
+      <w:t>.0</w:t>
     </w:r>
   </w:p>
 </w:hdr>
@@ -4758,7 +5062,6 @@
   <w:style w:type="character" w:default="1" w:styleId="DefaultParagraphFont">
     <w:name w:val="Default Paragraph Font"/>
     <w:uiPriority w:val="1"/>
-    <w:semiHidden/>
     <w:unhideWhenUsed/>
   </w:style>
   <w:style w:type="table" w:default="1" w:styleId="TableNormal">

</xml_diff>

<commit_message>
Update with scrum board
</commit_message>
<xml_diff>
--- a/Platform_SRS_v1.0.docx
+++ b/Platform_SRS_v1.0.docx
@@ -100,10 +100,7 @@
     </w:p>
     <w:p>
       <w:r>
-        <w:t>This Software Requirements Specification (SRS) defines the initial requirements for the Smart Parking Platform. Its structure follows the SRS format presented in Lecture 2: Introduction, Overall Description, Functional Requirements, Non-Functional Requirements, and Use Cases. The assigned semester project establishes the core capabilities of the platform, including real-time parking availability, maps, reservations, digital payments, notifications, operator tools, analytics, and third-party navigation integ</w:t>
-      </w:r>
-      <w:r>
-        <w:t>ration. Additional draft requirements in this version reflect initial project research and requirements elicitation and may be refined as stakeholder analysis continues.</w:t>
+        <w:t>This Software Requirements Specification (SRS) defines the initial requirements for the Smart Parking Platform. Its structure follows the SRS format presented in Lecture 2: Introduction, Overall Description, Functional Requirements, Non-Functional Requirements, and Use Cases. The assigned semester project establishes the core capabilities of the platform, including real-time parking availability, maps, reservations, digital payments, notifications, operator tools, analytics, and third-party navigation integration. Additional draft requirements in this version reflect initial project research and requirements elicitation and may be refined as stakeholder analysis continues.</w:t>
       </w:r>
     </w:p>
     <w:p>
@@ -3832,7 +3829,7 @@
           <v:shape id="_x0000_i1025" type="#_x0000_t75" style="width:531pt;height:28.5pt" o:ole="">
             <v:imagedata r:id="rId8" o:title=""/>
           </v:shape>
-          <o:OLEObject Type="Embed" ProgID="Word.Document.12" ShapeID="_x0000_i1025" DrawAspect="Content" ObjectID="_1851183312" r:id="rId9">
+          <o:OLEObject Type="Embed" ProgID="Word.Document.12" ShapeID="_x0000_i1025" DrawAspect="Content" ObjectID="_1851712664" r:id="rId9">
             <o:FieldCodes>\s</o:FieldCodes>
           </o:OLEObject>
         </w:object>
@@ -4042,26 +4039,249 @@
           <w:i/>
           <w:sz w:val="18"/>
         </w:rPr>
-        <w:t>Figure</w:t>
-      </w:r>
-      <w:r>
+        <w:t>Figure 2. Smart Parking Platform Gantt Chart</w:t>
+      </w:r>
+    </w:p>
+    <w:p>
+      <w:pPr>
+        <w:jc w:val="center"/>
+        <w:rPr>
+          <w:b/>
+          <w:bCs/>
+          <w:iCs/>
+          <w:sz w:val="28"/>
+          <w:szCs w:val="28"/>
+        </w:rPr>
+      </w:pPr>
+      <w:r>
+        <w:rPr>
+          <w:b/>
+          <w:bCs/>
+          <w:iCs/>
+          <w:sz w:val="28"/>
+          <w:szCs w:val="28"/>
+        </w:rPr>
+        <w:lastRenderedPageBreak/>
+        <w:t>Sprint 1 Planning and Scrum Board</w:t>
+      </w:r>
+    </w:p>
+    <w:p>
+      <w:pPr>
+        <w:rPr>
+          <w:iCs/>
+          <w:sz w:val="20"/>
+          <w:szCs w:val="20"/>
+        </w:rPr>
+      </w:pPr>
+      <w:r>
+        <w:rPr>
+          <w:iCs/>
+          <w:sz w:val="20"/>
+          <w:szCs w:val="20"/>
+        </w:rPr>
+        <w:t>Sprint 1 was planned in Jira using selected items from the Smart Parking Platform product backlog. The sprint focuses on establishing the initial application foundation, including authentication, database and API development, and initial user-facing interfaces.</w:t>
+      </w:r>
+    </w:p>
+    <w:p>
+      <w:pPr>
+        <w:jc w:val="center"/>
         <w:rPr>
           <w:i/>
           <w:sz w:val="18"/>
         </w:rPr>
-        <w:t xml:space="preserve"> 2</w:t>
-      </w:r>
+      </w:pPr>
       <w:r>
         <w:rPr>
           <w:i/>
           <w:sz w:val="18"/>
         </w:rPr>
-        <w:t>. Smart Parking Platform Gantt Chart</w:t>
-      </w:r>
+        <w:drawing>
+          <wp:inline distT="0" distB="0" distL="0" distR="0" wp14:anchorId="0D9563F1" wp14:editId="7C400C70">
+            <wp:extent cx="6217920" cy="3367405"/>
+            <wp:effectExtent l="0" t="0" r="0" b="4445"/>
+            <wp:docPr id="925097046" name="Picture 1"/>
+            <wp:cNvGraphicFramePr>
+              <a:graphicFrameLocks xmlns:a="http://schemas.openxmlformats.org/drawingml/2006/main" noChangeAspect="1"/>
+            </wp:cNvGraphicFramePr>
+            <a:graphic xmlns:a="http://schemas.openxmlformats.org/drawingml/2006/main">
+              <a:graphicData uri="http://schemas.openxmlformats.org/drawingml/2006/picture">
+                <pic:pic xmlns:pic="http://schemas.openxmlformats.org/drawingml/2006/picture">
+                  <pic:nvPicPr>
+                    <pic:cNvPr id="925097046" name=""/>
+                    <pic:cNvPicPr/>
+                  </pic:nvPicPr>
+                  <pic:blipFill>
+                    <a:blip r:embed="rId12"/>
+                    <a:stretch>
+                      <a:fillRect/>
+                    </a:stretch>
+                  </pic:blipFill>
+                  <pic:spPr>
+                    <a:xfrm>
+                      <a:off x="0" y="0"/>
+                      <a:ext cx="6217920" cy="3367405"/>
+                    </a:xfrm>
+                    <a:prstGeom prst="rect">
+                      <a:avLst/>
+                    </a:prstGeom>
+                  </pic:spPr>
+                </pic:pic>
+              </a:graphicData>
+            </a:graphic>
+          </wp:inline>
+        </w:drawing>
+      </w:r>
+    </w:p>
+    <w:p>
+      <w:pPr>
+        <w:jc w:val="center"/>
+        <w:rPr>
+          <w:i/>
+          <w:sz w:val="18"/>
+        </w:rPr>
+      </w:pPr>
+      <w:r>
+        <w:rPr>
+          <w:i/>
+          <w:sz w:val="18"/>
+        </w:rPr>
+        <w:t xml:space="preserve">Figure </w:t>
+      </w:r>
+      <w:r>
+        <w:rPr>
+          <w:i/>
+          <w:sz w:val="18"/>
+        </w:rPr>
+        <w:t>3</w:t>
+      </w:r>
+      <w:r>
+        <w:rPr>
+          <w:i/>
+          <w:sz w:val="18"/>
+        </w:rPr>
+        <w:t xml:space="preserve">. Smart Parking Platform </w:t>
+      </w:r>
+      <w:r>
+        <w:rPr>
+          <w:i/>
+          <w:sz w:val="18"/>
+        </w:rPr>
+        <w:t>Backlog</w:t>
+      </w:r>
+    </w:p>
+    <w:p>
+      <w:pPr>
+        <w:jc w:val="center"/>
+        <w:rPr>
+          <w:i/>
+          <w:sz w:val="18"/>
+        </w:rPr>
+      </w:pPr>
+      <w:r>
+        <w:rPr>
+          <w:i/>
+          <w:sz w:val="18"/>
+        </w:rPr>
+        <w:drawing>
+          <wp:inline distT="0" distB="0" distL="0" distR="0" wp14:anchorId="21B0A7D0" wp14:editId="25248A3F">
+            <wp:extent cx="6217920" cy="3046730"/>
+            <wp:effectExtent l="0" t="0" r="0" b="1270"/>
+            <wp:docPr id="1055251702" name="Picture 1"/>
+            <wp:cNvGraphicFramePr>
+              <a:graphicFrameLocks xmlns:a="http://schemas.openxmlformats.org/drawingml/2006/main" noChangeAspect="1"/>
+            </wp:cNvGraphicFramePr>
+            <a:graphic xmlns:a="http://schemas.openxmlformats.org/drawingml/2006/main">
+              <a:graphicData uri="http://schemas.openxmlformats.org/drawingml/2006/picture">
+                <pic:pic xmlns:pic="http://schemas.openxmlformats.org/drawingml/2006/picture">
+                  <pic:nvPicPr>
+                    <pic:cNvPr id="1055251702" name=""/>
+                    <pic:cNvPicPr/>
+                  </pic:nvPicPr>
+                  <pic:blipFill>
+                    <a:blip r:embed="rId13"/>
+                    <a:stretch>
+                      <a:fillRect/>
+                    </a:stretch>
+                  </pic:blipFill>
+                  <pic:spPr>
+                    <a:xfrm>
+                      <a:off x="0" y="0"/>
+                      <a:ext cx="6217920" cy="3046730"/>
+                    </a:xfrm>
+                    <a:prstGeom prst="rect">
+                      <a:avLst/>
+                    </a:prstGeom>
+                  </pic:spPr>
+                </pic:pic>
+              </a:graphicData>
+            </a:graphic>
+          </wp:inline>
+        </w:drawing>
+      </w:r>
+    </w:p>
+    <w:p>
+      <w:pPr>
+        <w:jc w:val="center"/>
+        <w:rPr>
+          <w:i/>
+          <w:sz w:val="18"/>
+        </w:rPr>
+      </w:pPr>
+      <w:r>
+        <w:rPr>
+          <w:i/>
+          <w:sz w:val="18"/>
+        </w:rPr>
+        <w:t xml:space="preserve">Figure </w:t>
+      </w:r>
+      <w:r>
+        <w:rPr>
+          <w:i/>
+          <w:sz w:val="18"/>
+        </w:rPr>
+        <w:t>3</w:t>
+      </w:r>
+      <w:r>
+        <w:rPr>
+          <w:i/>
+          <w:sz w:val="18"/>
+        </w:rPr>
+        <w:t>.</w:t>
+      </w:r>
+      <w:r>
+        <w:rPr>
+          <w:i/>
+          <w:sz w:val="18"/>
+        </w:rPr>
+        <w:t>1</w:t>
+      </w:r>
+      <w:r>
+        <w:rPr>
+          <w:i/>
+          <w:sz w:val="18"/>
+        </w:rPr>
+        <w:t xml:space="preserve"> Smart Parking Platform </w:t>
+      </w:r>
+      <w:r>
+        <w:rPr>
+          <w:i/>
+          <w:sz w:val="18"/>
+        </w:rPr>
+        <w:t>Sprint 1 Scrum Board</w:t>
+      </w:r>
+    </w:p>
+    <w:p>
+      <w:pPr>
+        <w:jc w:val="center"/>
+        <w:rPr>
+          <w:i/>
+          <w:sz w:val="18"/>
+        </w:rPr>
+      </w:pPr>
     </w:p>
     <w:sectPr>
-      <w:headerReference w:type="default" r:id="rId12"/>
-      <w:footerReference w:type="default" r:id="rId13"/>
+      <w:headerReference w:type="default" r:id="rId14"/>
+      <w:footerReference w:type="default" r:id="rId15"/>
       <w:pgSz w:w="12240" w:h="15840"/>
       <w:pgMar w:top="1080" w:right="1224" w:bottom="1080" w:left="1224" w:header="720" w:footer="720" w:gutter="0"/>
       <w:cols w:space="720"/>
@@ -4107,19 +4327,7 @@
       <w:rPr>
         <w:sz w:val="16"/>
       </w:rPr>
-      <w:t>CIS 4374</w:t>
-    </w:r>
-    <w:r>
-      <w:rPr>
-        <w:sz w:val="16"/>
-      </w:rPr>
-      <w:t xml:space="preserve"> | </w:t>
-    </w:r>
-    <w:r>
-      <w:rPr>
-        <w:sz w:val="16"/>
-      </w:rPr>
-      <w:t xml:space="preserve">September 10, </w:t>
+      <w:t xml:space="preserve">CIS 4374 | September 10, </w:t>
     </w:r>
     <w:proofErr w:type="gramStart"/>
     <w:r>
@@ -4133,19 +4341,7 @@
       <w:rPr>
         <w:sz w:val="16"/>
       </w:rPr>
-      <w:t xml:space="preserve"> </w:t>
-    </w:r>
-    <w:r>
-      <w:rPr>
-        <w:sz w:val="16"/>
-      </w:rPr>
-      <w:t xml:space="preserve">| </w:t>
-    </w:r>
-    <w:r>
-      <w:rPr>
-        <w:sz w:val="16"/>
-      </w:rPr>
-      <w:t xml:space="preserve">Page </w:t>
+      <w:t xml:space="preserve"> | Page </w:t>
     </w:r>
     <w:r>
       <w:fldChar w:fldCharType="begin"/>

</xml_diff>

<commit_message>
added risk register and candence
</commit_message>
<xml_diff>
--- a/Platform_SRS_v1.0.docx
+++ b/Platform_SRS_v1.0.docx
@@ -3829,7 +3829,7 @@
           <v:shape id="_x0000_i1025" type="#_x0000_t75" style="width:531pt;height:28.5pt" o:ole="">
             <v:imagedata r:id="rId8" o:title=""/>
           </v:shape>
-          <o:OLEObject Type="Embed" ProgID="Word.Document.12" ShapeID="_x0000_i1025" DrawAspect="Content" ObjectID="_1851712664" r:id="rId9">
+          <o:OLEObject Type="Embed" ProgID="Word.Document.12" ShapeID="_x0000_i1025" DrawAspect="Content" ObjectID="_1852310683" r:id="rId9">
             <o:FieldCodes>\s</o:FieldCodes>
           </o:OLEObject>
         </w:object>
@@ -4093,6 +4093,7 @@
       <w:r>
         <w:rPr>
           <w:i/>
+          <w:noProof/>
           <w:sz w:val="18"/>
         </w:rPr>
         <w:drawing>
@@ -4145,28 +4146,7 @@
           <w:i/>
           <w:sz w:val="18"/>
         </w:rPr>
-        <w:t xml:space="preserve">Figure </w:t>
-      </w:r>
-      <w:r>
-        <w:rPr>
-          <w:i/>
-          <w:sz w:val="18"/>
-        </w:rPr>
-        <w:t>3</w:t>
-      </w:r>
-      <w:r>
-        <w:rPr>
-          <w:i/>
-          <w:sz w:val="18"/>
-        </w:rPr>
-        <w:t xml:space="preserve">. Smart Parking Platform </w:t>
-      </w:r>
-      <w:r>
-        <w:rPr>
-          <w:i/>
-          <w:sz w:val="18"/>
-        </w:rPr>
-        <w:t>Backlog</w:t>
+        <w:t>Figure 3. Smart Parking Platform Backlog</w:t>
       </w:r>
     </w:p>
     <w:p>
@@ -4180,6 +4160,7 @@
       <w:r>
         <w:rPr>
           <w:i/>
+          <w:noProof/>
           <w:sz w:val="18"/>
         </w:rPr>
         <w:drawing>
@@ -4232,35 +4213,7 @@
           <w:i/>
           <w:sz w:val="18"/>
         </w:rPr>
-        <w:t xml:space="preserve">Figure </w:t>
-      </w:r>
-      <w:r>
-        <w:rPr>
-          <w:i/>
-          <w:sz w:val="18"/>
-        </w:rPr>
-        <w:t>3</w:t>
-      </w:r>
-      <w:r>
-        <w:rPr>
-          <w:i/>
-          <w:sz w:val="18"/>
-        </w:rPr>
-        <w:t>.</w:t>
-      </w:r>
-      <w:r>
-        <w:rPr>
-          <w:i/>
-          <w:sz w:val="18"/>
-        </w:rPr>
-        <w:t>1</w:t>
-      </w:r>
-      <w:r>
-        <w:rPr>
-          <w:i/>
-          <w:sz w:val="18"/>
-        </w:rPr>
-        <w:t xml:space="preserve"> Smart Parking Platform </w:t>
+        <w:t xml:space="preserve">Figure 3.1 Smart Parking Platform </w:t>
       </w:r>
       <w:r>
         <w:rPr>
@@ -4272,16 +4225,3693 @@
     </w:p>
     <w:p>
       <w:pPr>
-        <w:jc w:val="center"/>
         <w:rPr>
           <w:i/>
           <w:sz w:val="18"/>
         </w:rPr>
       </w:pPr>
+      <w:r>
+        <w:rPr>
+          <w:i/>
+          <w:sz w:val="18"/>
+        </w:rPr>
+        <w:br w:type="page"/>
+      </w:r>
+    </w:p>
+    <w:p>
+      <w:pPr>
+        <w:jc w:val="center"/>
+      </w:pPr>
+      <w:r>
+        <w:rPr>
+          <w:b/>
+          <w:color w:val="2F5597"/>
+          <w:sz w:val="36"/>
+        </w:rPr>
+        <w:lastRenderedPageBreak/>
+        <w:t>Risk Management and Communication Plan</w:t>
+      </w:r>
+    </w:p>
+    <w:p>
+      <w:r>
+        <w:rPr>
+          <w:sz w:val="24"/>
+        </w:rPr>
+        <w:t>CIS 4374 / TLIM 3355</w:t>
+      </w:r>
+      <w:r>
+        <w:rPr>
+          <w:sz w:val="24"/>
+        </w:rPr>
+        <w:br/>
+        <w:t>Weekly Project Deliverable</w:t>
+      </w:r>
+      <w:r>
+        <w:rPr>
+          <w:sz w:val="24"/>
+        </w:rPr>
+        <w:t xml:space="preserve"> 4</w:t>
+      </w:r>
+    </w:p>
+    <w:p>
+      <w:pPr>
+        <w:pStyle w:val="Heading1"/>
+      </w:pPr>
+      <w:r>
+        <w:t>1. Risk Management Plan</w:t>
+      </w:r>
+    </w:p>
+    <w:p>
+      <w:r>
+        <w:t>The Smart Parking Platform risk management plan</w:t>
+      </w:r>
+      <w:r>
+        <w:t xml:space="preserve"> helps</w:t>
+      </w:r>
+      <w:r>
+        <w:t xml:space="preserve"> </w:t>
+      </w:r>
+      <w:r>
+        <w:t xml:space="preserve">identify </w:t>
+      </w:r>
+      <w:r>
+        <w:t>uncertain events that could affect project objectives. Risks are grouped into four categories used in the course: technical, schedule, financial, and people. The project team will assess probability and impact, select an appropriate response strategy, assign ownership, and review open risks throughout the project.</w:t>
+      </w:r>
+    </w:p>
+    <w:p>
+      <w:pPr>
+        <w:pStyle w:val="Heading2"/>
+      </w:pPr>
+      <w:r>
+        <w:t>1.1 Risk Identification by Category</w:t>
+      </w:r>
+    </w:p>
+    <w:tbl>
+      <w:tblPr>
+        <w:tblStyle w:val="TableGrid"/>
+        <w:tblW w:w="0" w:type="auto"/>
+        <w:jc w:val="center"/>
+        <w:tblLook w:val="04A0" w:firstRow="1" w:lastRow="0" w:firstColumn="1" w:lastColumn="0" w:noHBand="0" w:noVBand="1"/>
+      </w:tblPr>
+      <w:tblGrid>
+        <w:gridCol w:w="1908"/>
+        <w:gridCol w:w="1800"/>
+        <w:gridCol w:w="6300"/>
+      </w:tblGrid>
+      <w:tr>
+        <w:trPr>
+          <w:cantSplit/>
+          <w:tblHeader/>
+          <w:jc w:val="center"/>
+        </w:trPr>
+        <w:tc>
+          <w:tcPr>
+            <w:tcW w:w="1908" w:type="dxa"/>
+            <w:shd w:val="clear" w:color="auto" w:fill="1F4E78"/>
+            <w:vAlign w:val="center"/>
+          </w:tcPr>
+          <w:p>
+            <w:r>
+              <w:rPr>
+                <w:b/>
+                <w:color w:val="FFFFFF"/>
+                <w:sz w:val="17"/>
+              </w:rPr>
+              <w:t>Category</w:t>
+            </w:r>
+          </w:p>
+        </w:tc>
+        <w:tc>
+          <w:tcPr>
+            <w:tcW w:w="1800" w:type="dxa"/>
+            <w:shd w:val="clear" w:color="auto" w:fill="1F4E78"/>
+            <w:vAlign w:val="center"/>
+          </w:tcPr>
+          <w:p>
+            <w:r>
+              <w:rPr>
+                <w:b/>
+                <w:color w:val="FFFFFF"/>
+                <w:sz w:val="17"/>
+              </w:rPr>
+              <w:t>ID</w:t>
+            </w:r>
+          </w:p>
+        </w:tc>
+        <w:tc>
+          <w:tcPr>
+            <w:tcW w:w="6300" w:type="dxa"/>
+            <w:shd w:val="clear" w:color="auto" w:fill="1F4E78"/>
+            <w:vAlign w:val="center"/>
+          </w:tcPr>
+          <w:p>
+            <w:r>
+              <w:rPr>
+                <w:b/>
+                <w:color w:val="FFFFFF"/>
+                <w:sz w:val="17"/>
+              </w:rPr>
+              <w:t>Risk</w:t>
+            </w:r>
+          </w:p>
+        </w:tc>
+      </w:tr>
+      <w:tr>
+        <w:trPr>
+          <w:cantSplit/>
+          <w:jc w:val="center"/>
+        </w:trPr>
+        <w:tc>
+          <w:tcPr>
+            <w:tcW w:w="1908" w:type="dxa"/>
+            <w:vAlign w:val="center"/>
+          </w:tcPr>
+          <w:p>
+            <w:pPr>
+              <w:rPr>
+                <w:sz w:val="24"/>
+                <w:szCs w:val="24"/>
+              </w:rPr>
+            </w:pPr>
+            <w:r>
+              <w:rPr>
+                <w:sz w:val="24"/>
+                <w:szCs w:val="24"/>
+              </w:rPr>
+              <w:t>Technical</w:t>
+            </w:r>
+          </w:p>
+        </w:tc>
+        <w:tc>
+          <w:tcPr>
+            <w:tcW w:w="1800" w:type="dxa"/>
+            <w:vAlign w:val="center"/>
+          </w:tcPr>
+          <w:p>
+            <w:pPr>
+              <w:rPr>
+                <w:sz w:val="24"/>
+                <w:szCs w:val="24"/>
+              </w:rPr>
+            </w:pPr>
+            <w:r>
+              <w:rPr>
+                <w:sz w:val="24"/>
+                <w:szCs w:val="24"/>
+              </w:rPr>
+              <w:t>T-01</w:t>
+            </w:r>
+          </w:p>
+        </w:tc>
+        <w:tc>
+          <w:tcPr>
+            <w:tcW w:w="6300" w:type="dxa"/>
+            <w:vAlign w:val="center"/>
+          </w:tcPr>
+          <w:p>
+            <w:pPr>
+              <w:rPr>
+                <w:sz w:val="24"/>
+                <w:szCs w:val="24"/>
+              </w:rPr>
+            </w:pPr>
+            <w:r>
+              <w:rPr>
+                <w:sz w:val="24"/>
+                <w:szCs w:val="24"/>
+              </w:rPr>
+              <w:t>Parking availability API or external integration becomes unavailable or unreliable.</w:t>
+            </w:r>
+          </w:p>
+        </w:tc>
+      </w:tr>
+      <w:tr>
+        <w:trPr>
+          <w:cantSplit/>
+          <w:jc w:val="center"/>
+        </w:trPr>
+        <w:tc>
+          <w:tcPr>
+            <w:tcW w:w="1908" w:type="dxa"/>
+            <w:vAlign w:val="center"/>
+          </w:tcPr>
+          <w:p>
+            <w:pPr>
+              <w:rPr>
+                <w:sz w:val="24"/>
+                <w:szCs w:val="24"/>
+              </w:rPr>
+            </w:pPr>
+            <w:r>
+              <w:rPr>
+                <w:sz w:val="24"/>
+                <w:szCs w:val="24"/>
+              </w:rPr>
+              <w:t>Technical</w:t>
+            </w:r>
+          </w:p>
+        </w:tc>
+        <w:tc>
+          <w:tcPr>
+            <w:tcW w:w="1800" w:type="dxa"/>
+            <w:vAlign w:val="center"/>
+          </w:tcPr>
+          <w:p>
+            <w:pPr>
+              <w:rPr>
+                <w:sz w:val="24"/>
+                <w:szCs w:val="24"/>
+              </w:rPr>
+            </w:pPr>
+            <w:r>
+              <w:rPr>
+                <w:sz w:val="24"/>
+                <w:szCs w:val="24"/>
+              </w:rPr>
+              <w:t>T-02</w:t>
+            </w:r>
+          </w:p>
+        </w:tc>
+        <w:tc>
+          <w:tcPr>
+            <w:tcW w:w="6300" w:type="dxa"/>
+            <w:vAlign w:val="center"/>
+          </w:tcPr>
+          <w:p>
+            <w:pPr>
+              <w:rPr>
+                <w:sz w:val="24"/>
+                <w:szCs w:val="24"/>
+              </w:rPr>
+            </w:pPr>
+            <w:r>
+              <w:rPr>
+                <w:sz w:val="24"/>
+                <w:szCs w:val="24"/>
+              </w:rPr>
+              <w:t>Payment provider integration fails or does not process transactions correctly.</w:t>
+            </w:r>
+          </w:p>
+        </w:tc>
+      </w:tr>
+      <w:tr>
+        <w:trPr>
+          <w:cantSplit/>
+          <w:jc w:val="center"/>
+        </w:trPr>
+        <w:tc>
+          <w:tcPr>
+            <w:tcW w:w="1908" w:type="dxa"/>
+            <w:vAlign w:val="center"/>
+          </w:tcPr>
+          <w:p>
+            <w:pPr>
+              <w:rPr>
+                <w:sz w:val="24"/>
+                <w:szCs w:val="24"/>
+              </w:rPr>
+            </w:pPr>
+            <w:r>
+              <w:rPr>
+                <w:sz w:val="24"/>
+                <w:szCs w:val="24"/>
+              </w:rPr>
+              <w:t>Technical</w:t>
+            </w:r>
+          </w:p>
+        </w:tc>
+        <w:tc>
+          <w:tcPr>
+            <w:tcW w:w="1800" w:type="dxa"/>
+            <w:vAlign w:val="center"/>
+          </w:tcPr>
+          <w:p>
+            <w:pPr>
+              <w:rPr>
+                <w:sz w:val="24"/>
+                <w:szCs w:val="24"/>
+              </w:rPr>
+            </w:pPr>
+            <w:r>
+              <w:rPr>
+                <w:sz w:val="24"/>
+                <w:szCs w:val="24"/>
+              </w:rPr>
+              <w:t>T-03</w:t>
+            </w:r>
+          </w:p>
+        </w:tc>
+        <w:tc>
+          <w:tcPr>
+            <w:tcW w:w="6300" w:type="dxa"/>
+            <w:vAlign w:val="center"/>
+          </w:tcPr>
+          <w:p>
+            <w:pPr>
+              <w:rPr>
+                <w:sz w:val="24"/>
+                <w:szCs w:val="24"/>
+              </w:rPr>
+            </w:pPr>
+            <w:r>
+              <w:rPr>
+                <w:sz w:val="24"/>
+                <w:szCs w:val="24"/>
+              </w:rPr>
+              <w:t>Map or navigation integration returns inaccurate location information.</w:t>
+            </w:r>
+          </w:p>
+        </w:tc>
+      </w:tr>
+      <w:tr>
+        <w:trPr>
+          <w:cantSplit/>
+          <w:jc w:val="center"/>
+        </w:trPr>
+        <w:tc>
+          <w:tcPr>
+            <w:tcW w:w="1908" w:type="dxa"/>
+            <w:vAlign w:val="center"/>
+          </w:tcPr>
+          <w:p>
+            <w:pPr>
+              <w:rPr>
+                <w:sz w:val="24"/>
+                <w:szCs w:val="24"/>
+              </w:rPr>
+            </w:pPr>
+            <w:r>
+              <w:rPr>
+                <w:sz w:val="24"/>
+                <w:szCs w:val="24"/>
+              </w:rPr>
+              <w:t>Technical</w:t>
+            </w:r>
+          </w:p>
+        </w:tc>
+        <w:tc>
+          <w:tcPr>
+            <w:tcW w:w="1800" w:type="dxa"/>
+            <w:vAlign w:val="center"/>
+          </w:tcPr>
+          <w:p>
+            <w:pPr>
+              <w:rPr>
+                <w:sz w:val="24"/>
+                <w:szCs w:val="24"/>
+              </w:rPr>
+            </w:pPr>
+            <w:r>
+              <w:rPr>
+                <w:sz w:val="24"/>
+                <w:szCs w:val="24"/>
+              </w:rPr>
+              <w:t>T-04</w:t>
+            </w:r>
+          </w:p>
+        </w:tc>
+        <w:tc>
+          <w:tcPr>
+            <w:tcW w:w="6300" w:type="dxa"/>
+            <w:vAlign w:val="center"/>
+          </w:tcPr>
+          <w:p>
+            <w:pPr>
+              <w:rPr>
+                <w:sz w:val="24"/>
+                <w:szCs w:val="24"/>
+              </w:rPr>
+            </w:pPr>
+            <w:r>
+              <w:rPr>
+                <w:sz w:val="24"/>
+                <w:szCs w:val="24"/>
+              </w:rPr>
+              <w:t>Authentication or user-data security vulnerability is discovered.</w:t>
+            </w:r>
+          </w:p>
+        </w:tc>
+      </w:tr>
+      <w:tr>
+        <w:trPr>
+          <w:cantSplit/>
+          <w:jc w:val="center"/>
+        </w:trPr>
+        <w:tc>
+          <w:tcPr>
+            <w:tcW w:w="1908" w:type="dxa"/>
+            <w:vAlign w:val="center"/>
+          </w:tcPr>
+          <w:p>
+            <w:pPr>
+              <w:rPr>
+                <w:sz w:val="24"/>
+                <w:szCs w:val="24"/>
+              </w:rPr>
+            </w:pPr>
+            <w:r>
+              <w:rPr>
+                <w:sz w:val="24"/>
+                <w:szCs w:val="24"/>
+              </w:rPr>
+              <w:t>Schedule</w:t>
+            </w:r>
+          </w:p>
+        </w:tc>
+        <w:tc>
+          <w:tcPr>
+            <w:tcW w:w="1800" w:type="dxa"/>
+            <w:vAlign w:val="center"/>
+          </w:tcPr>
+          <w:p>
+            <w:pPr>
+              <w:rPr>
+                <w:sz w:val="24"/>
+                <w:szCs w:val="24"/>
+              </w:rPr>
+            </w:pPr>
+            <w:r>
+              <w:rPr>
+                <w:sz w:val="24"/>
+                <w:szCs w:val="24"/>
+              </w:rPr>
+              <w:t>S-01</w:t>
+            </w:r>
+          </w:p>
+        </w:tc>
+        <w:tc>
+          <w:tcPr>
+            <w:tcW w:w="6300" w:type="dxa"/>
+            <w:vAlign w:val="center"/>
+          </w:tcPr>
+          <w:p>
+            <w:pPr>
+              <w:rPr>
+                <w:sz w:val="24"/>
+                <w:szCs w:val="24"/>
+              </w:rPr>
+            </w:pPr>
+            <w:r>
+              <w:rPr>
+                <w:sz w:val="24"/>
+                <w:szCs w:val="24"/>
+              </w:rPr>
+              <w:t>Third-party API integration takes longer than planned.</w:t>
+            </w:r>
+          </w:p>
+        </w:tc>
+      </w:tr>
+      <w:tr>
+        <w:trPr>
+          <w:cantSplit/>
+          <w:jc w:val="center"/>
+        </w:trPr>
+        <w:tc>
+          <w:tcPr>
+            <w:tcW w:w="1908" w:type="dxa"/>
+            <w:vAlign w:val="center"/>
+          </w:tcPr>
+          <w:p>
+            <w:pPr>
+              <w:rPr>
+                <w:sz w:val="24"/>
+                <w:szCs w:val="24"/>
+              </w:rPr>
+            </w:pPr>
+            <w:r>
+              <w:rPr>
+                <w:sz w:val="24"/>
+                <w:szCs w:val="24"/>
+              </w:rPr>
+              <w:t>Schedule</w:t>
+            </w:r>
+          </w:p>
+        </w:tc>
+        <w:tc>
+          <w:tcPr>
+            <w:tcW w:w="1800" w:type="dxa"/>
+            <w:vAlign w:val="center"/>
+          </w:tcPr>
+          <w:p>
+            <w:pPr>
+              <w:rPr>
+                <w:sz w:val="24"/>
+                <w:szCs w:val="24"/>
+              </w:rPr>
+            </w:pPr>
+            <w:r>
+              <w:rPr>
+                <w:sz w:val="24"/>
+                <w:szCs w:val="24"/>
+              </w:rPr>
+              <w:t>S-02</w:t>
+            </w:r>
+          </w:p>
+        </w:tc>
+        <w:tc>
+          <w:tcPr>
+            <w:tcW w:w="6300" w:type="dxa"/>
+            <w:vAlign w:val="center"/>
+          </w:tcPr>
+          <w:p>
+            <w:pPr>
+              <w:rPr>
+                <w:sz w:val="24"/>
+                <w:szCs w:val="24"/>
+              </w:rPr>
+            </w:pPr>
+            <w:r>
+              <w:rPr>
+                <w:sz w:val="24"/>
+                <w:szCs w:val="24"/>
+              </w:rPr>
+              <w:t>Testing identifies defects that require additional rework.</w:t>
+            </w:r>
+          </w:p>
+        </w:tc>
+      </w:tr>
+      <w:tr>
+        <w:trPr>
+          <w:cantSplit/>
+          <w:jc w:val="center"/>
+        </w:trPr>
+        <w:tc>
+          <w:tcPr>
+            <w:tcW w:w="1908" w:type="dxa"/>
+            <w:vAlign w:val="center"/>
+          </w:tcPr>
+          <w:p>
+            <w:pPr>
+              <w:rPr>
+                <w:sz w:val="24"/>
+                <w:szCs w:val="24"/>
+              </w:rPr>
+            </w:pPr>
+            <w:r>
+              <w:rPr>
+                <w:sz w:val="24"/>
+                <w:szCs w:val="24"/>
+              </w:rPr>
+              <w:t>Schedule</w:t>
+            </w:r>
+          </w:p>
+        </w:tc>
+        <w:tc>
+          <w:tcPr>
+            <w:tcW w:w="1800" w:type="dxa"/>
+            <w:vAlign w:val="center"/>
+          </w:tcPr>
+          <w:p>
+            <w:pPr>
+              <w:rPr>
+                <w:sz w:val="24"/>
+                <w:szCs w:val="24"/>
+              </w:rPr>
+            </w:pPr>
+            <w:r>
+              <w:rPr>
+                <w:sz w:val="24"/>
+                <w:szCs w:val="24"/>
+              </w:rPr>
+              <w:t>S-03</w:t>
+            </w:r>
+          </w:p>
+        </w:tc>
+        <w:tc>
+          <w:tcPr>
+            <w:tcW w:w="6300" w:type="dxa"/>
+            <w:vAlign w:val="center"/>
+          </w:tcPr>
+          <w:p>
+            <w:pPr>
+              <w:rPr>
+                <w:sz w:val="24"/>
+                <w:szCs w:val="24"/>
+              </w:rPr>
+            </w:pPr>
+            <w:r>
+              <w:rPr>
+                <w:sz w:val="24"/>
+                <w:szCs w:val="24"/>
+              </w:rPr>
+              <w:t>Dependencies between Teams 1, 2, and 3 delay downstream work.</w:t>
+            </w:r>
+          </w:p>
+        </w:tc>
+      </w:tr>
+      <w:tr>
+        <w:trPr>
+          <w:cantSplit/>
+          <w:jc w:val="center"/>
+        </w:trPr>
+        <w:tc>
+          <w:tcPr>
+            <w:tcW w:w="1908" w:type="dxa"/>
+            <w:vAlign w:val="center"/>
+          </w:tcPr>
+          <w:p>
+            <w:pPr>
+              <w:rPr>
+                <w:sz w:val="24"/>
+                <w:szCs w:val="24"/>
+              </w:rPr>
+            </w:pPr>
+            <w:r>
+              <w:rPr>
+                <w:sz w:val="24"/>
+                <w:szCs w:val="24"/>
+              </w:rPr>
+              <w:t>Schedule</w:t>
+            </w:r>
+          </w:p>
+        </w:tc>
+        <w:tc>
+          <w:tcPr>
+            <w:tcW w:w="1800" w:type="dxa"/>
+            <w:vAlign w:val="center"/>
+          </w:tcPr>
+          <w:p>
+            <w:pPr>
+              <w:rPr>
+                <w:sz w:val="24"/>
+                <w:szCs w:val="24"/>
+              </w:rPr>
+            </w:pPr>
+            <w:r>
+              <w:rPr>
+                <w:sz w:val="24"/>
+                <w:szCs w:val="24"/>
+              </w:rPr>
+              <w:t>S-04</w:t>
+            </w:r>
+          </w:p>
+        </w:tc>
+        <w:tc>
+          <w:tcPr>
+            <w:tcW w:w="6300" w:type="dxa"/>
+            <w:vAlign w:val="center"/>
+          </w:tcPr>
+          <w:p>
+            <w:pPr>
+              <w:rPr>
+                <w:sz w:val="24"/>
+                <w:szCs w:val="24"/>
+              </w:rPr>
+            </w:pPr>
+            <w:r>
+              <w:rPr>
+                <w:sz w:val="24"/>
+                <w:szCs w:val="24"/>
+              </w:rPr>
+              <w:t>Sprint work items require more effort than originally estimated.</w:t>
+            </w:r>
+          </w:p>
+        </w:tc>
+      </w:tr>
+      <w:tr>
+        <w:trPr>
+          <w:cantSplit/>
+          <w:jc w:val="center"/>
+        </w:trPr>
+        <w:tc>
+          <w:tcPr>
+            <w:tcW w:w="1908" w:type="dxa"/>
+            <w:vAlign w:val="center"/>
+          </w:tcPr>
+          <w:p>
+            <w:pPr>
+              <w:rPr>
+                <w:sz w:val="24"/>
+                <w:szCs w:val="24"/>
+              </w:rPr>
+            </w:pPr>
+            <w:r>
+              <w:rPr>
+                <w:sz w:val="24"/>
+                <w:szCs w:val="24"/>
+              </w:rPr>
+              <w:t>Financial</w:t>
+            </w:r>
+          </w:p>
+        </w:tc>
+        <w:tc>
+          <w:tcPr>
+            <w:tcW w:w="1800" w:type="dxa"/>
+            <w:vAlign w:val="center"/>
+          </w:tcPr>
+          <w:p>
+            <w:pPr>
+              <w:rPr>
+                <w:sz w:val="24"/>
+                <w:szCs w:val="24"/>
+              </w:rPr>
+            </w:pPr>
+            <w:r>
+              <w:rPr>
+                <w:sz w:val="24"/>
+                <w:szCs w:val="24"/>
+              </w:rPr>
+              <w:t>F-01</w:t>
+            </w:r>
+          </w:p>
+        </w:tc>
+        <w:tc>
+          <w:tcPr>
+            <w:tcW w:w="6300" w:type="dxa"/>
+            <w:vAlign w:val="center"/>
+          </w:tcPr>
+          <w:p>
+            <w:pPr>
+              <w:rPr>
+                <w:sz w:val="24"/>
+                <w:szCs w:val="24"/>
+              </w:rPr>
+            </w:pPr>
+            <w:r>
+              <w:rPr>
+                <w:sz w:val="24"/>
+                <w:szCs w:val="24"/>
+              </w:rPr>
+              <w:t>Third-party API or service costs exceed the project estimate.</w:t>
+            </w:r>
+          </w:p>
+        </w:tc>
+      </w:tr>
+      <w:tr>
+        <w:trPr>
+          <w:cantSplit/>
+          <w:jc w:val="center"/>
+        </w:trPr>
+        <w:tc>
+          <w:tcPr>
+            <w:tcW w:w="1908" w:type="dxa"/>
+            <w:vAlign w:val="center"/>
+          </w:tcPr>
+          <w:p>
+            <w:pPr>
+              <w:rPr>
+                <w:sz w:val="24"/>
+                <w:szCs w:val="24"/>
+              </w:rPr>
+            </w:pPr>
+            <w:r>
+              <w:rPr>
+                <w:sz w:val="24"/>
+                <w:szCs w:val="24"/>
+              </w:rPr>
+              <w:t>Financial</w:t>
+            </w:r>
+          </w:p>
+        </w:tc>
+        <w:tc>
+          <w:tcPr>
+            <w:tcW w:w="1800" w:type="dxa"/>
+            <w:vAlign w:val="center"/>
+          </w:tcPr>
+          <w:p>
+            <w:pPr>
+              <w:rPr>
+                <w:sz w:val="24"/>
+                <w:szCs w:val="24"/>
+              </w:rPr>
+            </w:pPr>
+            <w:r>
+              <w:rPr>
+                <w:sz w:val="24"/>
+                <w:szCs w:val="24"/>
+              </w:rPr>
+              <w:t>F-02</w:t>
+            </w:r>
+          </w:p>
+        </w:tc>
+        <w:tc>
+          <w:tcPr>
+            <w:tcW w:w="6300" w:type="dxa"/>
+            <w:vAlign w:val="center"/>
+          </w:tcPr>
+          <w:p>
+            <w:pPr>
+              <w:rPr>
+                <w:sz w:val="24"/>
+                <w:szCs w:val="24"/>
+              </w:rPr>
+            </w:pPr>
+            <w:r>
+              <w:rPr>
+                <w:sz w:val="24"/>
+                <w:szCs w:val="24"/>
+              </w:rPr>
+              <w:t>Cloud hosting or database usage costs exceed the project estimate.</w:t>
+            </w:r>
+          </w:p>
+        </w:tc>
+      </w:tr>
+      <w:tr>
+        <w:trPr>
+          <w:cantSplit/>
+          <w:jc w:val="center"/>
+        </w:trPr>
+        <w:tc>
+          <w:tcPr>
+            <w:tcW w:w="1908" w:type="dxa"/>
+            <w:vAlign w:val="center"/>
+          </w:tcPr>
+          <w:p>
+            <w:pPr>
+              <w:rPr>
+                <w:sz w:val="24"/>
+                <w:szCs w:val="24"/>
+              </w:rPr>
+            </w:pPr>
+            <w:r>
+              <w:rPr>
+                <w:sz w:val="24"/>
+                <w:szCs w:val="24"/>
+              </w:rPr>
+              <w:t>Financial</w:t>
+            </w:r>
+          </w:p>
+        </w:tc>
+        <w:tc>
+          <w:tcPr>
+            <w:tcW w:w="1800" w:type="dxa"/>
+            <w:vAlign w:val="center"/>
+          </w:tcPr>
+          <w:p>
+            <w:pPr>
+              <w:rPr>
+                <w:sz w:val="24"/>
+                <w:szCs w:val="24"/>
+              </w:rPr>
+            </w:pPr>
+            <w:r>
+              <w:rPr>
+                <w:sz w:val="24"/>
+                <w:szCs w:val="24"/>
+              </w:rPr>
+              <w:t>F-03</w:t>
+            </w:r>
+          </w:p>
+        </w:tc>
+        <w:tc>
+          <w:tcPr>
+            <w:tcW w:w="6300" w:type="dxa"/>
+            <w:vAlign w:val="center"/>
+          </w:tcPr>
+          <w:p>
+            <w:pPr>
+              <w:rPr>
+                <w:sz w:val="24"/>
+                <w:szCs w:val="24"/>
+              </w:rPr>
+            </w:pPr>
+            <w:r>
+              <w:rPr>
+                <w:sz w:val="24"/>
+                <w:szCs w:val="24"/>
+              </w:rPr>
+              <w:t>Payment processing fees are higher than expected.</w:t>
+            </w:r>
+          </w:p>
+        </w:tc>
+      </w:tr>
+      <w:tr>
+        <w:trPr>
+          <w:cantSplit/>
+          <w:jc w:val="center"/>
+        </w:trPr>
+        <w:tc>
+          <w:tcPr>
+            <w:tcW w:w="1908" w:type="dxa"/>
+            <w:vAlign w:val="center"/>
+          </w:tcPr>
+          <w:p>
+            <w:pPr>
+              <w:rPr>
+                <w:sz w:val="24"/>
+                <w:szCs w:val="24"/>
+              </w:rPr>
+            </w:pPr>
+            <w:r>
+              <w:rPr>
+                <w:sz w:val="24"/>
+                <w:szCs w:val="24"/>
+              </w:rPr>
+              <w:t>Financial</w:t>
+            </w:r>
+          </w:p>
+        </w:tc>
+        <w:tc>
+          <w:tcPr>
+            <w:tcW w:w="1800" w:type="dxa"/>
+            <w:vAlign w:val="center"/>
+          </w:tcPr>
+          <w:p>
+            <w:pPr>
+              <w:rPr>
+                <w:sz w:val="24"/>
+                <w:szCs w:val="24"/>
+              </w:rPr>
+            </w:pPr>
+            <w:r>
+              <w:rPr>
+                <w:sz w:val="24"/>
+                <w:szCs w:val="24"/>
+              </w:rPr>
+              <w:t>F-04</w:t>
+            </w:r>
+          </w:p>
+        </w:tc>
+        <w:tc>
+          <w:tcPr>
+            <w:tcW w:w="6300" w:type="dxa"/>
+            <w:vAlign w:val="center"/>
+          </w:tcPr>
+          <w:p>
+            <w:pPr>
+              <w:rPr>
+                <w:sz w:val="24"/>
+                <w:szCs w:val="24"/>
+              </w:rPr>
+            </w:pPr>
+            <w:r>
+              <w:rPr>
+                <w:sz w:val="24"/>
+                <w:szCs w:val="24"/>
+              </w:rPr>
+              <w:t>Defect correction and rework increase development costs.</w:t>
+            </w:r>
+          </w:p>
+        </w:tc>
+      </w:tr>
+      <w:tr>
+        <w:trPr>
+          <w:cantSplit/>
+          <w:jc w:val="center"/>
+        </w:trPr>
+        <w:tc>
+          <w:tcPr>
+            <w:tcW w:w="1908" w:type="dxa"/>
+            <w:vAlign w:val="center"/>
+          </w:tcPr>
+          <w:p>
+            <w:pPr>
+              <w:rPr>
+                <w:sz w:val="24"/>
+                <w:szCs w:val="24"/>
+              </w:rPr>
+            </w:pPr>
+            <w:r>
+              <w:rPr>
+                <w:sz w:val="24"/>
+                <w:szCs w:val="24"/>
+              </w:rPr>
+              <w:t>People</w:t>
+            </w:r>
+          </w:p>
+        </w:tc>
+        <w:tc>
+          <w:tcPr>
+            <w:tcW w:w="1800" w:type="dxa"/>
+            <w:vAlign w:val="center"/>
+          </w:tcPr>
+          <w:p>
+            <w:pPr>
+              <w:rPr>
+                <w:sz w:val="24"/>
+                <w:szCs w:val="24"/>
+              </w:rPr>
+            </w:pPr>
+            <w:r>
+              <w:rPr>
+                <w:sz w:val="24"/>
+                <w:szCs w:val="24"/>
+              </w:rPr>
+              <w:t>P-01</w:t>
+            </w:r>
+          </w:p>
+        </w:tc>
+        <w:tc>
+          <w:tcPr>
+            <w:tcW w:w="6300" w:type="dxa"/>
+            <w:vAlign w:val="center"/>
+          </w:tcPr>
+          <w:p>
+            <w:pPr>
+              <w:rPr>
+                <w:sz w:val="24"/>
+                <w:szCs w:val="24"/>
+              </w:rPr>
+            </w:pPr>
+            <w:r>
+              <w:rPr>
+                <w:sz w:val="24"/>
+                <w:szCs w:val="24"/>
+              </w:rPr>
+              <w:t>A team member becomes unavailable during a critical project period.</w:t>
+            </w:r>
+          </w:p>
+        </w:tc>
+      </w:tr>
+      <w:tr>
+        <w:trPr>
+          <w:cantSplit/>
+          <w:jc w:val="center"/>
+        </w:trPr>
+        <w:tc>
+          <w:tcPr>
+            <w:tcW w:w="1908" w:type="dxa"/>
+            <w:vAlign w:val="center"/>
+          </w:tcPr>
+          <w:p>
+            <w:pPr>
+              <w:rPr>
+                <w:sz w:val="24"/>
+                <w:szCs w:val="24"/>
+              </w:rPr>
+            </w:pPr>
+            <w:r>
+              <w:rPr>
+                <w:sz w:val="24"/>
+                <w:szCs w:val="24"/>
+              </w:rPr>
+              <w:t>People</w:t>
+            </w:r>
+          </w:p>
+        </w:tc>
+        <w:tc>
+          <w:tcPr>
+            <w:tcW w:w="1800" w:type="dxa"/>
+            <w:vAlign w:val="center"/>
+          </w:tcPr>
+          <w:p>
+            <w:pPr>
+              <w:rPr>
+                <w:sz w:val="24"/>
+                <w:szCs w:val="24"/>
+              </w:rPr>
+            </w:pPr>
+            <w:r>
+              <w:rPr>
+                <w:sz w:val="24"/>
+                <w:szCs w:val="24"/>
+              </w:rPr>
+              <w:t>P-02</w:t>
+            </w:r>
+          </w:p>
+        </w:tc>
+        <w:tc>
+          <w:tcPr>
+            <w:tcW w:w="6300" w:type="dxa"/>
+            <w:vAlign w:val="center"/>
+          </w:tcPr>
+          <w:p>
+            <w:pPr>
+              <w:rPr>
+                <w:sz w:val="24"/>
+                <w:szCs w:val="24"/>
+              </w:rPr>
+            </w:pPr>
+            <w:r>
+              <w:rPr>
+                <w:sz w:val="24"/>
+                <w:szCs w:val="24"/>
+              </w:rPr>
+              <w:t>The team lacks sufficient experience with a required technology or integration.</w:t>
+            </w:r>
+          </w:p>
+        </w:tc>
+      </w:tr>
+      <w:tr>
+        <w:trPr>
+          <w:cantSplit/>
+          <w:jc w:val="center"/>
+        </w:trPr>
+        <w:tc>
+          <w:tcPr>
+            <w:tcW w:w="1908" w:type="dxa"/>
+            <w:vAlign w:val="center"/>
+          </w:tcPr>
+          <w:p>
+            <w:pPr>
+              <w:rPr>
+                <w:sz w:val="24"/>
+                <w:szCs w:val="24"/>
+              </w:rPr>
+            </w:pPr>
+            <w:r>
+              <w:rPr>
+                <w:sz w:val="24"/>
+                <w:szCs w:val="24"/>
+              </w:rPr>
+              <w:t>People</w:t>
+            </w:r>
+          </w:p>
+        </w:tc>
+        <w:tc>
+          <w:tcPr>
+            <w:tcW w:w="1800" w:type="dxa"/>
+            <w:vAlign w:val="center"/>
+          </w:tcPr>
+          <w:p>
+            <w:pPr>
+              <w:rPr>
+                <w:sz w:val="24"/>
+                <w:szCs w:val="24"/>
+              </w:rPr>
+            </w:pPr>
+            <w:r>
+              <w:rPr>
+                <w:sz w:val="24"/>
+                <w:szCs w:val="24"/>
+              </w:rPr>
+              <w:t>P-03</w:t>
+            </w:r>
+          </w:p>
+        </w:tc>
+        <w:tc>
+          <w:tcPr>
+            <w:tcW w:w="6300" w:type="dxa"/>
+            <w:vAlign w:val="center"/>
+          </w:tcPr>
+          <w:p>
+            <w:pPr>
+              <w:rPr>
+                <w:sz w:val="24"/>
+                <w:szCs w:val="24"/>
+              </w:rPr>
+            </w:pPr>
+            <w:r>
+              <w:rPr>
+                <w:sz w:val="24"/>
+                <w:szCs w:val="24"/>
+              </w:rPr>
+              <w:t>Poor communication between teams causes duplicate work or rework.</w:t>
+            </w:r>
+          </w:p>
+        </w:tc>
+      </w:tr>
+      <w:tr>
+        <w:trPr>
+          <w:cantSplit/>
+          <w:jc w:val="center"/>
+        </w:trPr>
+        <w:tc>
+          <w:tcPr>
+            <w:tcW w:w="1908" w:type="dxa"/>
+            <w:vAlign w:val="center"/>
+          </w:tcPr>
+          <w:p>
+            <w:pPr>
+              <w:rPr>
+                <w:sz w:val="24"/>
+                <w:szCs w:val="24"/>
+              </w:rPr>
+            </w:pPr>
+            <w:r>
+              <w:rPr>
+                <w:sz w:val="24"/>
+                <w:szCs w:val="24"/>
+              </w:rPr>
+              <w:t>People</w:t>
+            </w:r>
+          </w:p>
+        </w:tc>
+        <w:tc>
+          <w:tcPr>
+            <w:tcW w:w="1800" w:type="dxa"/>
+            <w:vAlign w:val="center"/>
+          </w:tcPr>
+          <w:p>
+            <w:pPr>
+              <w:rPr>
+                <w:sz w:val="24"/>
+                <w:szCs w:val="24"/>
+              </w:rPr>
+            </w:pPr>
+            <w:r>
+              <w:rPr>
+                <w:sz w:val="24"/>
+                <w:szCs w:val="24"/>
+              </w:rPr>
+              <w:t>P-04</w:t>
+            </w:r>
+          </w:p>
+        </w:tc>
+        <w:tc>
+          <w:tcPr>
+            <w:tcW w:w="6300" w:type="dxa"/>
+            <w:vAlign w:val="center"/>
+          </w:tcPr>
+          <w:p>
+            <w:pPr>
+              <w:rPr>
+                <w:sz w:val="24"/>
+                <w:szCs w:val="24"/>
+              </w:rPr>
+            </w:pPr>
+            <w:r>
+              <w:rPr>
+                <w:sz w:val="24"/>
+                <w:szCs w:val="24"/>
+              </w:rPr>
+              <w:t>Conflicting priorities or unclear responsibilities delay assigned work.</w:t>
+            </w:r>
+          </w:p>
+        </w:tc>
+      </w:tr>
+    </w:tbl>
+    <w:p/>
+    <w:p>
+      <w:pPr>
+        <w:pStyle w:val="Heading2"/>
+      </w:pPr>
+      <w:r>
+        <w:lastRenderedPageBreak/>
+        <w:t>1.2 Risk Register</w:t>
+      </w:r>
+    </w:p>
+    <w:p>
+      <w:r>
+        <w:t>The register below tracks priority project risks. Probability and impact use the qualitative levels presented in class, and response strategies use Avoid, Mitigate, Transfer, or Accept.</w:t>
+      </w:r>
+    </w:p>
+    <w:tbl>
+      <w:tblPr>
+        <w:tblStyle w:val="TableGrid"/>
+        <w:tblW w:w="0" w:type="auto"/>
+        <w:jc w:val="center"/>
+        <w:tblLook w:val="04A0" w:firstRow="1" w:lastRow="0" w:firstColumn="1" w:lastColumn="0" w:noHBand="0" w:noVBand="1"/>
+      </w:tblPr>
+      <w:tblGrid>
+        <w:gridCol w:w="1006"/>
+        <w:gridCol w:w="1182"/>
+        <w:gridCol w:w="1479"/>
+        <w:gridCol w:w="1180"/>
+        <w:gridCol w:w="1264"/>
+        <w:gridCol w:w="1157"/>
+        <w:gridCol w:w="1144"/>
+        <w:gridCol w:w="1596"/>
+      </w:tblGrid>
+      <w:tr>
+        <w:trPr>
+          <w:cantSplit/>
+          <w:tblHeader/>
+          <w:jc w:val="center"/>
+        </w:trPr>
+        <w:tc>
+          <w:tcPr>
+            <w:tcW w:w="1278" w:type="dxa"/>
+            <w:shd w:val="clear" w:color="auto" w:fill="1F4E78"/>
+            <w:vAlign w:val="center"/>
+          </w:tcPr>
+          <w:p>
+            <w:r>
+              <w:rPr>
+                <w:b/>
+                <w:color w:val="FFFFFF"/>
+                <w:sz w:val="14"/>
+              </w:rPr>
+              <w:t>ID</w:t>
+            </w:r>
+          </w:p>
+        </w:tc>
+        <w:tc>
+          <w:tcPr>
+            <w:tcW w:w="1278" w:type="dxa"/>
+            <w:shd w:val="clear" w:color="auto" w:fill="1F4E78"/>
+            <w:vAlign w:val="center"/>
+          </w:tcPr>
+          <w:p>
+            <w:r>
+              <w:rPr>
+                <w:b/>
+                <w:color w:val="FFFFFF"/>
+                <w:sz w:val="14"/>
+              </w:rPr>
+              <w:t>Category</w:t>
+            </w:r>
+          </w:p>
+        </w:tc>
+        <w:tc>
+          <w:tcPr>
+            <w:tcW w:w="1278" w:type="dxa"/>
+            <w:shd w:val="clear" w:color="auto" w:fill="1F4E78"/>
+            <w:vAlign w:val="center"/>
+          </w:tcPr>
+          <w:p>
+            <w:r>
+              <w:rPr>
+                <w:b/>
+                <w:color w:val="FFFFFF"/>
+                <w:sz w:val="14"/>
+              </w:rPr>
+              <w:t>Description</w:t>
+            </w:r>
+          </w:p>
+        </w:tc>
+        <w:tc>
+          <w:tcPr>
+            <w:tcW w:w="1278" w:type="dxa"/>
+            <w:shd w:val="clear" w:color="auto" w:fill="1F4E78"/>
+            <w:vAlign w:val="center"/>
+          </w:tcPr>
+          <w:p>
+            <w:r>
+              <w:rPr>
+                <w:b/>
+                <w:color w:val="FFFFFF"/>
+                <w:sz w:val="14"/>
+              </w:rPr>
+              <w:t>Probability</w:t>
+            </w:r>
+          </w:p>
+        </w:tc>
+        <w:tc>
+          <w:tcPr>
+            <w:tcW w:w="1278" w:type="dxa"/>
+            <w:shd w:val="clear" w:color="auto" w:fill="1F4E78"/>
+            <w:vAlign w:val="center"/>
+          </w:tcPr>
+          <w:p>
+            <w:r>
+              <w:rPr>
+                <w:b/>
+                <w:color w:val="FFFFFF"/>
+                <w:sz w:val="14"/>
+              </w:rPr>
+              <w:t>Impact</w:t>
+            </w:r>
+          </w:p>
+        </w:tc>
+        <w:tc>
+          <w:tcPr>
+            <w:tcW w:w="1278" w:type="dxa"/>
+            <w:shd w:val="clear" w:color="auto" w:fill="1F4E78"/>
+            <w:vAlign w:val="center"/>
+          </w:tcPr>
+          <w:p>
+            <w:r>
+              <w:rPr>
+                <w:b/>
+                <w:color w:val="FFFFFF"/>
+                <w:sz w:val="14"/>
+              </w:rPr>
+              <w:t>Owner</w:t>
+            </w:r>
+          </w:p>
+        </w:tc>
+        <w:tc>
+          <w:tcPr>
+            <w:tcW w:w="1278" w:type="dxa"/>
+            <w:shd w:val="clear" w:color="auto" w:fill="1F4E78"/>
+            <w:vAlign w:val="center"/>
+          </w:tcPr>
+          <w:p>
+            <w:r>
+              <w:rPr>
+                <w:b/>
+                <w:color w:val="FFFFFF"/>
+                <w:sz w:val="14"/>
+              </w:rPr>
+              <w:t>Response</w:t>
+            </w:r>
+          </w:p>
+        </w:tc>
+        <w:tc>
+          <w:tcPr>
+            <w:tcW w:w="1278" w:type="dxa"/>
+            <w:shd w:val="clear" w:color="auto" w:fill="1F4E78"/>
+            <w:vAlign w:val="center"/>
+          </w:tcPr>
+          <w:p>
+            <w:r>
+              <w:rPr>
+                <w:b/>
+                <w:color w:val="FFFFFF"/>
+                <w:sz w:val="14"/>
+              </w:rPr>
+              <w:t>Status / Notes</w:t>
+            </w:r>
+          </w:p>
+        </w:tc>
+      </w:tr>
+      <w:tr>
+        <w:trPr>
+          <w:cantSplit/>
+          <w:jc w:val="center"/>
+        </w:trPr>
+        <w:tc>
+          <w:tcPr>
+            <w:tcW w:w="1278" w:type="dxa"/>
+            <w:vAlign w:val="center"/>
+          </w:tcPr>
+          <w:p>
+            <w:pPr>
+              <w:rPr>
+                <w:sz w:val="18"/>
+                <w:szCs w:val="18"/>
+              </w:rPr>
+            </w:pPr>
+            <w:r>
+              <w:rPr>
+                <w:sz w:val="18"/>
+                <w:szCs w:val="18"/>
+              </w:rPr>
+              <w:t>R-01</w:t>
+            </w:r>
+          </w:p>
+        </w:tc>
+        <w:tc>
+          <w:tcPr>
+            <w:tcW w:w="1278" w:type="dxa"/>
+            <w:vAlign w:val="center"/>
+          </w:tcPr>
+          <w:p>
+            <w:pPr>
+              <w:rPr>
+                <w:sz w:val="18"/>
+                <w:szCs w:val="18"/>
+              </w:rPr>
+            </w:pPr>
+            <w:r>
+              <w:rPr>
+                <w:sz w:val="18"/>
+                <w:szCs w:val="18"/>
+              </w:rPr>
+              <w:t>Technical</w:t>
+            </w:r>
+          </w:p>
+        </w:tc>
+        <w:tc>
+          <w:tcPr>
+            <w:tcW w:w="1278" w:type="dxa"/>
+            <w:vAlign w:val="center"/>
+          </w:tcPr>
+          <w:p>
+            <w:pPr>
+              <w:rPr>
+                <w:sz w:val="18"/>
+                <w:szCs w:val="18"/>
+              </w:rPr>
+            </w:pPr>
+            <w:r>
+              <w:rPr>
+                <w:sz w:val="18"/>
+                <w:szCs w:val="18"/>
+              </w:rPr>
+              <w:t>Parking availability API/integration becomes unavailable.</w:t>
+            </w:r>
+          </w:p>
+        </w:tc>
+        <w:tc>
+          <w:tcPr>
+            <w:tcW w:w="1278" w:type="dxa"/>
+            <w:vAlign w:val="center"/>
+          </w:tcPr>
+          <w:p>
+            <w:pPr>
+              <w:rPr>
+                <w:sz w:val="18"/>
+                <w:szCs w:val="18"/>
+              </w:rPr>
+            </w:pPr>
+            <w:r>
+              <w:rPr>
+                <w:sz w:val="18"/>
+                <w:szCs w:val="18"/>
+              </w:rPr>
+              <w:t>Moderate</w:t>
+            </w:r>
+          </w:p>
+        </w:tc>
+        <w:tc>
+          <w:tcPr>
+            <w:tcW w:w="1278" w:type="dxa"/>
+            <w:vAlign w:val="center"/>
+          </w:tcPr>
+          <w:p>
+            <w:pPr>
+              <w:rPr>
+                <w:sz w:val="18"/>
+                <w:szCs w:val="18"/>
+              </w:rPr>
+            </w:pPr>
+            <w:r>
+              <w:rPr>
+                <w:sz w:val="18"/>
+                <w:szCs w:val="18"/>
+              </w:rPr>
+              <w:t>Major</w:t>
+            </w:r>
+          </w:p>
+        </w:tc>
+        <w:tc>
+          <w:tcPr>
+            <w:tcW w:w="1278" w:type="dxa"/>
+            <w:vAlign w:val="center"/>
+          </w:tcPr>
+          <w:p>
+            <w:pPr>
+              <w:rPr>
+                <w:sz w:val="18"/>
+                <w:szCs w:val="18"/>
+              </w:rPr>
+            </w:pPr>
+            <w:r>
+              <w:rPr>
+                <w:sz w:val="18"/>
+                <w:szCs w:val="18"/>
+              </w:rPr>
+              <w:t>Team 3</w:t>
+            </w:r>
+          </w:p>
+        </w:tc>
+        <w:tc>
+          <w:tcPr>
+            <w:tcW w:w="1278" w:type="dxa"/>
+            <w:vAlign w:val="center"/>
+          </w:tcPr>
+          <w:p>
+            <w:pPr>
+              <w:rPr>
+                <w:sz w:val="18"/>
+                <w:szCs w:val="18"/>
+              </w:rPr>
+            </w:pPr>
+            <w:r>
+              <w:rPr>
+                <w:sz w:val="18"/>
+                <w:szCs w:val="18"/>
+              </w:rPr>
+              <w:t>Mitigate</w:t>
+            </w:r>
+          </w:p>
+        </w:tc>
+        <w:tc>
+          <w:tcPr>
+            <w:tcW w:w="1278" w:type="dxa"/>
+            <w:vAlign w:val="center"/>
+          </w:tcPr>
+          <w:p>
+            <w:pPr>
+              <w:rPr>
+                <w:sz w:val="18"/>
+                <w:szCs w:val="18"/>
+              </w:rPr>
+            </w:pPr>
+            <w:r>
+              <w:rPr>
+                <w:sz w:val="18"/>
+                <w:szCs w:val="18"/>
+              </w:rPr>
+              <w:t>Open - monitor API reliability; design fallback handling.</w:t>
+            </w:r>
+          </w:p>
+        </w:tc>
+      </w:tr>
+      <w:tr>
+        <w:trPr>
+          <w:cantSplit/>
+          <w:jc w:val="center"/>
+        </w:trPr>
+        <w:tc>
+          <w:tcPr>
+            <w:tcW w:w="1278" w:type="dxa"/>
+            <w:vAlign w:val="center"/>
+          </w:tcPr>
+          <w:p>
+            <w:pPr>
+              <w:rPr>
+                <w:sz w:val="18"/>
+                <w:szCs w:val="18"/>
+              </w:rPr>
+            </w:pPr>
+            <w:r>
+              <w:rPr>
+                <w:sz w:val="18"/>
+                <w:szCs w:val="18"/>
+              </w:rPr>
+              <w:t>R-02</w:t>
+            </w:r>
+          </w:p>
+        </w:tc>
+        <w:tc>
+          <w:tcPr>
+            <w:tcW w:w="1278" w:type="dxa"/>
+            <w:vAlign w:val="center"/>
+          </w:tcPr>
+          <w:p>
+            <w:pPr>
+              <w:rPr>
+                <w:sz w:val="18"/>
+                <w:szCs w:val="18"/>
+              </w:rPr>
+            </w:pPr>
+            <w:r>
+              <w:rPr>
+                <w:sz w:val="18"/>
+                <w:szCs w:val="18"/>
+              </w:rPr>
+              <w:t>Technical</w:t>
+            </w:r>
+          </w:p>
+        </w:tc>
+        <w:tc>
+          <w:tcPr>
+            <w:tcW w:w="1278" w:type="dxa"/>
+            <w:vAlign w:val="center"/>
+          </w:tcPr>
+          <w:p>
+            <w:pPr>
+              <w:rPr>
+                <w:sz w:val="18"/>
+                <w:szCs w:val="18"/>
+              </w:rPr>
+            </w:pPr>
+            <w:r>
+              <w:rPr>
+                <w:sz w:val="18"/>
+                <w:szCs w:val="18"/>
+              </w:rPr>
+              <w:t xml:space="preserve">Payment provider integration </w:t>
+            </w:r>
+            <w:proofErr w:type="gramStart"/>
+            <w:r>
+              <w:rPr>
+                <w:sz w:val="18"/>
+                <w:szCs w:val="18"/>
+              </w:rPr>
+              <w:t>fails</w:t>
+            </w:r>
+            <w:proofErr w:type="gramEnd"/>
+            <w:r>
+              <w:rPr>
+                <w:sz w:val="18"/>
+                <w:szCs w:val="18"/>
+              </w:rPr>
+              <w:t xml:space="preserve"> or transactions are rejected.</w:t>
+            </w:r>
+          </w:p>
+        </w:tc>
+        <w:tc>
+          <w:tcPr>
+            <w:tcW w:w="1278" w:type="dxa"/>
+            <w:vAlign w:val="center"/>
+          </w:tcPr>
+          <w:p>
+            <w:pPr>
+              <w:rPr>
+                <w:sz w:val="18"/>
+                <w:szCs w:val="18"/>
+              </w:rPr>
+            </w:pPr>
+            <w:r>
+              <w:rPr>
+                <w:sz w:val="18"/>
+                <w:szCs w:val="18"/>
+              </w:rPr>
+              <w:t>Low</w:t>
+            </w:r>
+          </w:p>
+        </w:tc>
+        <w:tc>
+          <w:tcPr>
+            <w:tcW w:w="1278" w:type="dxa"/>
+            <w:vAlign w:val="center"/>
+          </w:tcPr>
+          <w:p>
+            <w:pPr>
+              <w:rPr>
+                <w:sz w:val="18"/>
+                <w:szCs w:val="18"/>
+              </w:rPr>
+            </w:pPr>
+            <w:r>
+              <w:rPr>
+                <w:sz w:val="18"/>
+                <w:szCs w:val="18"/>
+              </w:rPr>
+              <w:t>Major</w:t>
+            </w:r>
+          </w:p>
+        </w:tc>
+        <w:tc>
+          <w:tcPr>
+            <w:tcW w:w="1278" w:type="dxa"/>
+            <w:vAlign w:val="center"/>
+          </w:tcPr>
+          <w:p>
+            <w:pPr>
+              <w:rPr>
+                <w:sz w:val="18"/>
+                <w:szCs w:val="18"/>
+              </w:rPr>
+            </w:pPr>
+            <w:r>
+              <w:rPr>
+                <w:sz w:val="18"/>
+                <w:szCs w:val="18"/>
+              </w:rPr>
+              <w:t>Team 3</w:t>
+            </w:r>
+          </w:p>
+        </w:tc>
+        <w:tc>
+          <w:tcPr>
+            <w:tcW w:w="1278" w:type="dxa"/>
+            <w:vAlign w:val="center"/>
+          </w:tcPr>
+          <w:p>
+            <w:pPr>
+              <w:rPr>
+                <w:sz w:val="18"/>
+                <w:szCs w:val="18"/>
+              </w:rPr>
+            </w:pPr>
+            <w:r>
+              <w:rPr>
+                <w:sz w:val="18"/>
+                <w:szCs w:val="18"/>
+              </w:rPr>
+              <w:t>Mitigate</w:t>
+            </w:r>
+          </w:p>
+        </w:tc>
+        <w:tc>
+          <w:tcPr>
+            <w:tcW w:w="1278" w:type="dxa"/>
+            <w:vAlign w:val="center"/>
+          </w:tcPr>
+          <w:p>
+            <w:pPr>
+              <w:rPr>
+                <w:sz w:val="18"/>
+                <w:szCs w:val="18"/>
+              </w:rPr>
+            </w:pPr>
+            <w:r>
+              <w:rPr>
+                <w:sz w:val="18"/>
+                <w:szCs w:val="18"/>
+              </w:rPr>
+              <w:t>Open - test integration in a controlled environment.</w:t>
+            </w:r>
+          </w:p>
+        </w:tc>
+      </w:tr>
+      <w:tr>
+        <w:trPr>
+          <w:cantSplit/>
+          <w:jc w:val="center"/>
+        </w:trPr>
+        <w:tc>
+          <w:tcPr>
+            <w:tcW w:w="1278" w:type="dxa"/>
+            <w:vAlign w:val="center"/>
+          </w:tcPr>
+          <w:p>
+            <w:pPr>
+              <w:rPr>
+                <w:sz w:val="18"/>
+                <w:szCs w:val="18"/>
+              </w:rPr>
+            </w:pPr>
+            <w:r>
+              <w:rPr>
+                <w:sz w:val="18"/>
+                <w:szCs w:val="18"/>
+              </w:rPr>
+              <w:t>R-03</w:t>
+            </w:r>
+          </w:p>
+        </w:tc>
+        <w:tc>
+          <w:tcPr>
+            <w:tcW w:w="1278" w:type="dxa"/>
+            <w:vAlign w:val="center"/>
+          </w:tcPr>
+          <w:p>
+            <w:pPr>
+              <w:rPr>
+                <w:sz w:val="18"/>
+                <w:szCs w:val="18"/>
+              </w:rPr>
+            </w:pPr>
+            <w:r>
+              <w:rPr>
+                <w:sz w:val="18"/>
+                <w:szCs w:val="18"/>
+              </w:rPr>
+              <w:t>Technical</w:t>
+            </w:r>
+          </w:p>
+        </w:tc>
+        <w:tc>
+          <w:tcPr>
+            <w:tcW w:w="1278" w:type="dxa"/>
+            <w:vAlign w:val="center"/>
+          </w:tcPr>
+          <w:p>
+            <w:pPr>
+              <w:rPr>
+                <w:sz w:val="18"/>
+                <w:szCs w:val="18"/>
+              </w:rPr>
+            </w:pPr>
+            <w:r>
+              <w:rPr>
+                <w:sz w:val="18"/>
+                <w:szCs w:val="18"/>
+              </w:rPr>
+              <w:t>Map/location data is inaccurate.</w:t>
+            </w:r>
+          </w:p>
+        </w:tc>
+        <w:tc>
+          <w:tcPr>
+            <w:tcW w:w="1278" w:type="dxa"/>
+            <w:vAlign w:val="center"/>
+          </w:tcPr>
+          <w:p>
+            <w:pPr>
+              <w:rPr>
+                <w:sz w:val="18"/>
+                <w:szCs w:val="18"/>
+              </w:rPr>
+            </w:pPr>
+            <w:r>
+              <w:rPr>
+                <w:sz w:val="18"/>
+                <w:szCs w:val="18"/>
+              </w:rPr>
+              <w:t>Moderate</w:t>
+            </w:r>
+          </w:p>
+        </w:tc>
+        <w:tc>
+          <w:tcPr>
+            <w:tcW w:w="1278" w:type="dxa"/>
+            <w:vAlign w:val="center"/>
+          </w:tcPr>
+          <w:p>
+            <w:pPr>
+              <w:rPr>
+                <w:sz w:val="18"/>
+                <w:szCs w:val="18"/>
+              </w:rPr>
+            </w:pPr>
+            <w:r>
+              <w:rPr>
+                <w:sz w:val="18"/>
+                <w:szCs w:val="18"/>
+              </w:rPr>
+              <w:t>Moderate</w:t>
+            </w:r>
+          </w:p>
+        </w:tc>
+        <w:tc>
+          <w:tcPr>
+            <w:tcW w:w="1278" w:type="dxa"/>
+            <w:vAlign w:val="center"/>
+          </w:tcPr>
+          <w:p>
+            <w:pPr>
+              <w:rPr>
+                <w:sz w:val="18"/>
+                <w:szCs w:val="18"/>
+              </w:rPr>
+            </w:pPr>
+            <w:r>
+              <w:rPr>
+                <w:sz w:val="18"/>
+                <w:szCs w:val="18"/>
+              </w:rPr>
+              <w:t>Team 2</w:t>
+            </w:r>
+          </w:p>
+        </w:tc>
+        <w:tc>
+          <w:tcPr>
+            <w:tcW w:w="1278" w:type="dxa"/>
+            <w:vAlign w:val="center"/>
+          </w:tcPr>
+          <w:p>
+            <w:pPr>
+              <w:rPr>
+                <w:sz w:val="18"/>
+                <w:szCs w:val="18"/>
+              </w:rPr>
+            </w:pPr>
+            <w:r>
+              <w:rPr>
+                <w:sz w:val="18"/>
+                <w:szCs w:val="18"/>
+              </w:rPr>
+              <w:t>Mitigate</w:t>
+            </w:r>
+          </w:p>
+        </w:tc>
+        <w:tc>
+          <w:tcPr>
+            <w:tcW w:w="1278" w:type="dxa"/>
+            <w:vAlign w:val="center"/>
+          </w:tcPr>
+          <w:p>
+            <w:pPr>
+              <w:rPr>
+                <w:sz w:val="18"/>
+                <w:szCs w:val="18"/>
+              </w:rPr>
+            </w:pPr>
+            <w:r>
+              <w:rPr>
+                <w:sz w:val="18"/>
+                <w:szCs w:val="18"/>
+              </w:rPr>
+              <w:t>Open - validate location results and provide user confirmation.</w:t>
+            </w:r>
+          </w:p>
+        </w:tc>
+      </w:tr>
+      <w:tr>
+        <w:trPr>
+          <w:cantSplit/>
+          <w:jc w:val="center"/>
+        </w:trPr>
+        <w:tc>
+          <w:tcPr>
+            <w:tcW w:w="1278" w:type="dxa"/>
+            <w:vAlign w:val="center"/>
+          </w:tcPr>
+          <w:p>
+            <w:pPr>
+              <w:rPr>
+                <w:sz w:val="18"/>
+                <w:szCs w:val="18"/>
+              </w:rPr>
+            </w:pPr>
+            <w:r>
+              <w:rPr>
+                <w:sz w:val="18"/>
+                <w:szCs w:val="18"/>
+              </w:rPr>
+              <w:t>R-04</w:t>
+            </w:r>
+          </w:p>
+        </w:tc>
+        <w:tc>
+          <w:tcPr>
+            <w:tcW w:w="1278" w:type="dxa"/>
+            <w:vAlign w:val="center"/>
+          </w:tcPr>
+          <w:p>
+            <w:pPr>
+              <w:rPr>
+                <w:sz w:val="18"/>
+                <w:szCs w:val="18"/>
+              </w:rPr>
+            </w:pPr>
+            <w:r>
+              <w:rPr>
+                <w:sz w:val="18"/>
+                <w:szCs w:val="18"/>
+              </w:rPr>
+              <w:t>Technical</w:t>
+            </w:r>
+          </w:p>
+        </w:tc>
+        <w:tc>
+          <w:tcPr>
+            <w:tcW w:w="1278" w:type="dxa"/>
+            <w:vAlign w:val="center"/>
+          </w:tcPr>
+          <w:p>
+            <w:pPr>
+              <w:rPr>
+                <w:sz w:val="18"/>
+                <w:szCs w:val="18"/>
+              </w:rPr>
+            </w:pPr>
+            <w:r>
+              <w:rPr>
+                <w:sz w:val="18"/>
+                <w:szCs w:val="18"/>
+              </w:rPr>
+              <w:t>Authentication or user-data security vulnerability is discovered.</w:t>
+            </w:r>
+          </w:p>
+        </w:tc>
+        <w:tc>
+          <w:tcPr>
+            <w:tcW w:w="1278" w:type="dxa"/>
+            <w:vAlign w:val="center"/>
+          </w:tcPr>
+          <w:p>
+            <w:pPr>
+              <w:rPr>
+                <w:sz w:val="18"/>
+                <w:szCs w:val="18"/>
+              </w:rPr>
+            </w:pPr>
+            <w:r>
+              <w:rPr>
+                <w:sz w:val="18"/>
+                <w:szCs w:val="18"/>
+              </w:rPr>
+              <w:t>Low</w:t>
+            </w:r>
+          </w:p>
+        </w:tc>
+        <w:tc>
+          <w:tcPr>
+            <w:tcW w:w="1278" w:type="dxa"/>
+            <w:vAlign w:val="center"/>
+          </w:tcPr>
+          <w:p>
+            <w:pPr>
+              <w:rPr>
+                <w:sz w:val="18"/>
+                <w:szCs w:val="18"/>
+              </w:rPr>
+            </w:pPr>
+            <w:r>
+              <w:rPr>
+                <w:sz w:val="18"/>
+                <w:szCs w:val="18"/>
+              </w:rPr>
+              <w:t>Catastrophic</w:t>
+            </w:r>
+          </w:p>
+        </w:tc>
+        <w:tc>
+          <w:tcPr>
+            <w:tcW w:w="1278" w:type="dxa"/>
+            <w:vAlign w:val="center"/>
+          </w:tcPr>
+          <w:p>
+            <w:pPr>
+              <w:rPr>
+                <w:sz w:val="18"/>
+                <w:szCs w:val="18"/>
+              </w:rPr>
+            </w:pPr>
+            <w:r>
+              <w:rPr>
+                <w:sz w:val="18"/>
+                <w:szCs w:val="18"/>
+              </w:rPr>
+              <w:t>Team 1</w:t>
+            </w:r>
+          </w:p>
+        </w:tc>
+        <w:tc>
+          <w:tcPr>
+            <w:tcW w:w="1278" w:type="dxa"/>
+            <w:vAlign w:val="center"/>
+          </w:tcPr>
+          <w:p>
+            <w:pPr>
+              <w:rPr>
+                <w:sz w:val="18"/>
+                <w:szCs w:val="18"/>
+              </w:rPr>
+            </w:pPr>
+            <w:r>
+              <w:rPr>
+                <w:sz w:val="18"/>
+                <w:szCs w:val="18"/>
+              </w:rPr>
+              <w:t>Mitigate</w:t>
+            </w:r>
+          </w:p>
+        </w:tc>
+        <w:tc>
+          <w:tcPr>
+            <w:tcW w:w="1278" w:type="dxa"/>
+            <w:vAlign w:val="center"/>
+          </w:tcPr>
+          <w:p>
+            <w:pPr>
+              <w:rPr>
+                <w:sz w:val="18"/>
+                <w:szCs w:val="18"/>
+              </w:rPr>
+            </w:pPr>
+            <w:r>
+              <w:rPr>
+                <w:sz w:val="18"/>
+                <w:szCs w:val="18"/>
+              </w:rPr>
+              <w:t>Open - use secure authentication practices and security testing.</w:t>
+            </w:r>
+          </w:p>
+        </w:tc>
+      </w:tr>
+      <w:tr>
+        <w:trPr>
+          <w:cantSplit/>
+          <w:jc w:val="center"/>
+        </w:trPr>
+        <w:tc>
+          <w:tcPr>
+            <w:tcW w:w="1278" w:type="dxa"/>
+            <w:vAlign w:val="center"/>
+          </w:tcPr>
+          <w:p>
+            <w:pPr>
+              <w:rPr>
+                <w:sz w:val="18"/>
+                <w:szCs w:val="18"/>
+              </w:rPr>
+            </w:pPr>
+            <w:r>
+              <w:rPr>
+                <w:sz w:val="18"/>
+                <w:szCs w:val="18"/>
+              </w:rPr>
+              <w:t>R-05</w:t>
+            </w:r>
+          </w:p>
+        </w:tc>
+        <w:tc>
+          <w:tcPr>
+            <w:tcW w:w="1278" w:type="dxa"/>
+            <w:vAlign w:val="center"/>
+          </w:tcPr>
+          <w:p>
+            <w:pPr>
+              <w:rPr>
+                <w:sz w:val="18"/>
+                <w:szCs w:val="18"/>
+              </w:rPr>
+            </w:pPr>
+            <w:r>
+              <w:rPr>
+                <w:sz w:val="18"/>
+                <w:szCs w:val="18"/>
+              </w:rPr>
+              <w:t>Schedule</w:t>
+            </w:r>
+          </w:p>
+        </w:tc>
+        <w:tc>
+          <w:tcPr>
+            <w:tcW w:w="1278" w:type="dxa"/>
+            <w:vAlign w:val="center"/>
+          </w:tcPr>
+          <w:p>
+            <w:pPr>
+              <w:rPr>
+                <w:sz w:val="18"/>
+                <w:szCs w:val="18"/>
+              </w:rPr>
+            </w:pPr>
+            <w:r>
+              <w:rPr>
+                <w:sz w:val="18"/>
+                <w:szCs w:val="18"/>
+              </w:rPr>
+              <w:t>API integration takes longer than scheduled.</w:t>
+            </w:r>
+          </w:p>
+        </w:tc>
+        <w:tc>
+          <w:tcPr>
+            <w:tcW w:w="1278" w:type="dxa"/>
+            <w:vAlign w:val="center"/>
+          </w:tcPr>
+          <w:p>
+            <w:pPr>
+              <w:rPr>
+                <w:sz w:val="18"/>
+                <w:szCs w:val="18"/>
+              </w:rPr>
+            </w:pPr>
+            <w:r>
+              <w:rPr>
+                <w:sz w:val="18"/>
+                <w:szCs w:val="18"/>
+              </w:rPr>
+              <w:t>Moderate</w:t>
+            </w:r>
+          </w:p>
+        </w:tc>
+        <w:tc>
+          <w:tcPr>
+            <w:tcW w:w="1278" w:type="dxa"/>
+            <w:vAlign w:val="center"/>
+          </w:tcPr>
+          <w:p>
+            <w:pPr>
+              <w:rPr>
+                <w:sz w:val="18"/>
+                <w:szCs w:val="18"/>
+              </w:rPr>
+            </w:pPr>
+            <w:r>
+              <w:rPr>
+                <w:sz w:val="18"/>
+                <w:szCs w:val="18"/>
+              </w:rPr>
+              <w:t>Major</w:t>
+            </w:r>
+          </w:p>
+        </w:tc>
+        <w:tc>
+          <w:tcPr>
+            <w:tcW w:w="1278" w:type="dxa"/>
+            <w:vAlign w:val="center"/>
+          </w:tcPr>
+          <w:p>
+            <w:pPr>
+              <w:rPr>
+                <w:sz w:val="18"/>
+                <w:szCs w:val="18"/>
+              </w:rPr>
+            </w:pPr>
+            <w:r>
+              <w:rPr>
+                <w:sz w:val="18"/>
+                <w:szCs w:val="18"/>
+              </w:rPr>
+              <w:t>Team 3</w:t>
+            </w:r>
+          </w:p>
+        </w:tc>
+        <w:tc>
+          <w:tcPr>
+            <w:tcW w:w="1278" w:type="dxa"/>
+            <w:vAlign w:val="center"/>
+          </w:tcPr>
+          <w:p>
+            <w:pPr>
+              <w:rPr>
+                <w:sz w:val="18"/>
+                <w:szCs w:val="18"/>
+              </w:rPr>
+            </w:pPr>
+            <w:r>
+              <w:rPr>
+                <w:sz w:val="18"/>
+                <w:szCs w:val="18"/>
+              </w:rPr>
+              <w:t>Mitigate</w:t>
+            </w:r>
+          </w:p>
+        </w:tc>
+        <w:tc>
+          <w:tcPr>
+            <w:tcW w:w="1278" w:type="dxa"/>
+            <w:vAlign w:val="center"/>
+          </w:tcPr>
+          <w:p>
+            <w:pPr>
+              <w:rPr>
+                <w:sz w:val="18"/>
+                <w:szCs w:val="18"/>
+              </w:rPr>
+            </w:pPr>
+            <w:r>
+              <w:rPr>
+                <w:sz w:val="18"/>
+                <w:szCs w:val="18"/>
+              </w:rPr>
+              <w:t>Open - track dependencies and begin integration work early.</w:t>
+            </w:r>
+          </w:p>
+        </w:tc>
+      </w:tr>
+      <w:tr>
+        <w:trPr>
+          <w:cantSplit/>
+          <w:jc w:val="center"/>
+        </w:trPr>
+        <w:tc>
+          <w:tcPr>
+            <w:tcW w:w="1278" w:type="dxa"/>
+            <w:vAlign w:val="center"/>
+          </w:tcPr>
+          <w:p>
+            <w:pPr>
+              <w:rPr>
+                <w:sz w:val="18"/>
+                <w:szCs w:val="18"/>
+              </w:rPr>
+            </w:pPr>
+            <w:r>
+              <w:rPr>
+                <w:sz w:val="18"/>
+                <w:szCs w:val="18"/>
+              </w:rPr>
+              <w:t>R-06</w:t>
+            </w:r>
+          </w:p>
+        </w:tc>
+        <w:tc>
+          <w:tcPr>
+            <w:tcW w:w="1278" w:type="dxa"/>
+            <w:vAlign w:val="center"/>
+          </w:tcPr>
+          <w:p>
+            <w:pPr>
+              <w:rPr>
+                <w:sz w:val="18"/>
+                <w:szCs w:val="18"/>
+              </w:rPr>
+            </w:pPr>
+            <w:r>
+              <w:rPr>
+                <w:sz w:val="18"/>
+                <w:szCs w:val="18"/>
+              </w:rPr>
+              <w:t>Schedule</w:t>
+            </w:r>
+          </w:p>
+        </w:tc>
+        <w:tc>
+          <w:tcPr>
+            <w:tcW w:w="1278" w:type="dxa"/>
+            <w:vAlign w:val="center"/>
+          </w:tcPr>
+          <w:p>
+            <w:pPr>
+              <w:rPr>
+                <w:sz w:val="18"/>
+                <w:szCs w:val="18"/>
+              </w:rPr>
+            </w:pPr>
+            <w:r>
+              <w:rPr>
+                <w:sz w:val="18"/>
+                <w:szCs w:val="18"/>
+              </w:rPr>
+              <w:t>Testing reveals defects requiring rework.</w:t>
+            </w:r>
+          </w:p>
+        </w:tc>
+        <w:tc>
+          <w:tcPr>
+            <w:tcW w:w="1278" w:type="dxa"/>
+            <w:vAlign w:val="center"/>
+          </w:tcPr>
+          <w:p>
+            <w:pPr>
+              <w:rPr>
+                <w:sz w:val="18"/>
+                <w:szCs w:val="18"/>
+              </w:rPr>
+            </w:pPr>
+            <w:r>
+              <w:rPr>
+                <w:sz w:val="18"/>
+                <w:szCs w:val="18"/>
+              </w:rPr>
+              <w:t>Moderate</w:t>
+            </w:r>
+          </w:p>
+        </w:tc>
+        <w:tc>
+          <w:tcPr>
+            <w:tcW w:w="1278" w:type="dxa"/>
+            <w:vAlign w:val="center"/>
+          </w:tcPr>
+          <w:p>
+            <w:pPr>
+              <w:rPr>
+                <w:sz w:val="18"/>
+                <w:szCs w:val="18"/>
+              </w:rPr>
+            </w:pPr>
+            <w:r>
+              <w:rPr>
+                <w:sz w:val="18"/>
+                <w:szCs w:val="18"/>
+              </w:rPr>
+              <w:t>Moderate</w:t>
+            </w:r>
+          </w:p>
+        </w:tc>
+        <w:tc>
+          <w:tcPr>
+            <w:tcW w:w="1278" w:type="dxa"/>
+            <w:vAlign w:val="center"/>
+          </w:tcPr>
+          <w:p>
+            <w:pPr>
+              <w:rPr>
+                <w:sz w:val="18"/>
+                <w:szCs w:val="18"/>
+              </w:rPr>
+            </w:pPr>
+            <w:r>
+              <w:rPr>
+                <w:sz w:val="18"/>
+                <w:szCs w:val="18"/>
+              </w:rPr>
+              <w:t>Team 3</w:t>
+            </w:r>
+          </w:p>
+        </w:tc>
+        <w:tc>
+          <w:tcPr>
+            <w:tcW w:w="1278" w:type="dxa"/>
+            <w:vAlign w:val="center"/>
+          </w:tcPr>
+          <w:p>
+            <w:pPr>
+              <w:rPr>
+                <w:sz w:val="18"/>
+                <w:szCs w:val="18"/>
+              </w:rPr>
+            </w:pPr>
+            <w:r>
+              <w:rPr>
+                <w:sz w:val="18"/>
+                <w:szCs w:val="18"/>
+              </w:rPr>
+              <w:t>Mitigate</w:t>
+            </w:r>
+          </w:p>
+        </w:tc>
+        <w:tc>
+          <w:tcPr>
+            <w:tcW w:w="1278" w:type="dxa"/>
+            <w:vAlign w:val="center"/>
+          </w:tcPr>
+          <w:p>
+            <w:pPr>
+              <w:rPr>
+                <w:sz w:val="18"/>
+                <w:szCs w:val="18"/>
+              </w:rPr>
+            </w:pPr>
+            <w:r>
+              <w:rPr>
+                <w:sz w:val="18"/>
+                <w:szCs w:val="18"/>
+              </w:rPr>
+              <w:t>Open - test incrementally and reserve time for corrections.</w:t>
+            </w:r>
+          </w:p>
+        </w:tc>
+      </w:tr>
+      <w:tr>
+        <w:trPr>
+          <w:cantSplit/>
+          <w:jc w:val="center"/>
+        </w:trPr>
+        <w:tc>
+          <w:tcPr>
+            <w:tcW w:w="1278" w:type="dxa"/>
+            <w:vAlign w:val="center"/>
+          </w:tcPr>
+          <w:p>
+            <w:pPr>
+              <w:rPr>
+                <w:sz w:val="18"/>
+                <w:szCs w:val="18"/>
+              </w:rPr>
+            </w:pPr>
+            <w:r>
+              <w:rPr>
+                <w:sz w:val="18"/>
+                <w:szCs w:val="18"/>
+              </w:rPr>
+              <w:t>R-07</w:t>
+            </w:r>
+          </w:p>
+        </w:tc>
+        <w:tc>
+          <w:tcPr>
+            <w:tcW w:w="1278" w:type="dxa"/>
+            <w:vAlign w:val="center"/>
+          </w:tcPr>
+          <w:p>
+            <w:pPr>
+              <w:rPr>
+                <w:sz w:val="18"/>
+                <w:szCs w:val="18"/>
+              </w:rPr>
+            </w:pPr>
+            <w:r>
+              <w:rPr>
+                <w:sz w:val="18"/>
+                <w:szCs w:val="18"/>
+              </w:rPr>
+              <w:t>Schedule</w:t>
+            </w:r>
+          </w:p>
+        </w:tc>
+        <w:tc>
+          <w:tcPr>
+            <w:tcW w:w="1278" w:type="dxa"/>
+            <w:vAlign w:val="center"/>
+          </w:tcPr>
+          <w:p>
+            <w:pPr>
+              <w:rPr>
+                <w:sz w:val="18"/>
+                <w:szCs w:val="18"/>
+              </w:rPr>
+            </w:pPr>
+            <w:r>
+              <w:rPr>
+                <w:sz w:val="18"/>
+                <w:szCs w:val="18"/>
+              </w:rPr>
+              <w:t>Cross-team dependencies delay Sprint work.</w:t>
+            </w:r>
+          </w:p>
+        </w:tc>
+        <w:tc>
+          <w:tcPr>
+            <w:tcW w:w="1278" w:type="dxa"/>
+            <w:vAlign w:val="center"/>
+          </w:tcPr>
+          <w:p>
+            <w:pPr>
+              <w:rPr>
+                <w:sz w:val="18"/>
+                <w:szCs w:val="18"/>
+              </w:rPr>
+            </w:pPr>
+            <w:r>
+              <w:rPr>
+                <w:sz w:val="18"/>
+                <w:szCs w:val="18"/>
+              </w:rPr>
+              <w:t>Moderate</w:t>
+            </w:r>
+          </w:p>
+        </w:tc>
+        <w:tc>
+          <w:tcPr>
+            <w:tcW w:w="1278" w:type="dxa"/>
+            <w:vAlign w:val="center"/>
+          </w:tcPr>
+          <w:p>
+            <w:pPr>
+              <w:rPr>
+                <w:sz w:val="18"/>
+                <w:szCs w:val="18"/>
+              </w:rPr>
+            </w:pPr>
+            <w:r>
+              <w:rPr>
+                <w:sz w:val="18"/>
+                <w:szCs w:val="18"/>
+              </w:rPr>
+              <w:t>Moderate</w:t>
+            </w:r>
+          </w:p>
+        </w:tc>
+        <w:tc>
+          <w:tcPr>
+            <w:tcW w:w="1278" w:type="dxa"/>
+            <w:vAlign w:val="center"/>
+          </w:tcPr>
+          <w:p>
+            <w:pPr>
+              <w:rPr>
+                <w:sz w:val="18"/>
+                <w:szCs w:val="18"/>
+              </w:rPr>
+            </w:pPr>
+            <w:r>
+              <w:rPr>
+                <w:sz w:val="18"/>
+                <w:szCs w:val="18"/>
+              </w:rPr>
+              <w:t>Team 1</w:t>
+            </w:r>
+          </w:p>
+        </w:tc>
+        <w:tc>
+          <w:tcPr>
+            <w:tcW w:w="1278" w:type="dxa"/>
+            <w:vAlign w:val="center"/>
+          </w:tcPr>
+          <w:p>
+            <w:pPr>
+              <w:rPr>
+                <w:sz w:val="18"/>
+                <w:szCs w:val="18"/>
+              </w:rPr>
+            </w:pPr>
+            <w:r>
+              <w:rPr>
+                <w:sz w:val="18"/>
+                <w:szCs w:val="18"/>
+              </w:rPr>
+              <w:t>Mitigate</w:t>
+            </w:r>
+          </w:p>
+        </w:tc>
+        <w:tc>
+          <w:tcPr>
+            <w:tcW w:w="1278" w:type="dxa"/>
+            <w:vAlign w:val="center"/>
+          </w:tcPr>
+          <w:p>
+            <w:pPr>
+              <w:rPr>
+                <w:sz w:val="18"/>
+                <w:szCs w:val="18"/>
+              </w:rPr>
+            </w:pPr>
+            <w:r>
+              <w:rPr>
+                <w:sz w:val="18"/>
+                <w:szCs w:val="18"/>
+              </w:rPr>
+              <w:t>Open - review blockers during cross-team meetings.</w:t>
+            </w:r>
+          </w:p>
+        </w:tc>
+      </w:tr>
+      <w:tr>
+        <w:trPr>
+          <w:cantSplit/>
+          <w:jc w:val="center"/>
+        </w:trPr>
+        <w:tc>
+          <w:tcPr>
+            <w:tcW w:w="1278" w:type="dxa"/>
+            <w:vAlign w:val="center"/>
+          </w:tcPr>
+          <w:p>
+            <w:pPr>
+              <w:rPr>
+                <w:sz w:val="18"/>
+                <w:szCs w:val="18"/>
+              </w:rPr>
+            </w:pPr>
+            <w:r>
+              <w:rPr>
+                <w:sz w:val="18"/>
+                <w:szCs w:val="18"/>
+              </w:rPr>
+              <w:t>R-08</w:t>
+            </w:r>
+          </w:p>
+        </w:tc>
+        <w:tc>
+          <w:tcPr>
+            <w:tcW w:w="1278" w:type="dxa"/>
+            <w:vAlign w:val="center"/>
+          </w:tcPr>
+          <w:p>
+            <w:pPr>
+              <w:rPr>
+                <w:sz w:val="18"/>
+                <w:szCs w:val="18"/>
+              </w:rPr>
+            </w:pPr>
+            <w:r>
+              <w:rPr>
+                <w:sz w:val="18"/>
+                <w:szCs w:val="18"/>
+              </w:rPr>
+              <w:t>Schedule</w:t>
+            </w:r>
+          </w:p>
+        </w:tc>
+        <w:tc>
+          <w:tcPr>
+            <w:tcW w:w="1278" w:type="dxa"/>
+            <w:vAlign w:val="center"/>
+          </w:tcPr>
+          <w:p>
+            <w:pPr>
+              <w:rPr>
+                <w:sz w:val="18"/>
+                <w:szCs w:val="18"/>
+              </w:rPr>
+            </w:pPr>
+            <w:r>
+              <w:rPr>
+                <w:sz w:val="18"/>
+                <w:szCs w:val="18"/>
+              </w:rPr>
+              <w:t>Sprint estimates are too optimistic.</w:t>
+            </w:r>
+          </w:p>
+        </w:tc>
+        <w:tc>
+          <w:tcPr>
+            <w:tcW w:w="1278" w:type="dxa"/>
+            <w:vAlign w:val="center"/>
+          </w:tcPr>
+          <w:p>
+            <w:pPr>
+              <w:rPr>
+                <w:sz w:val="18"/>
+                <w:szCs w:val="18"/>
+              </w:rPr>
+            </w:pPr>
+            <w:r>
+              <w:rPr>
+                <w:sz w:val="18"/>
+                <w:szCs w:val="18"/>
+              </w:rPr>
+              <w:t>Moderate</w:t>
+            </w:r>
+          </w:p>
+        </w:tc>
+        <w:tc>
+          <w:tcPr>
+            <w:tcW w:w="1278" w:type="dxa"/>
+            <w:vAlign w:val="center"/>
+          </w:tcPr>
+          <w:p>
+            <w:pPr>
+              <w:rPr>
+                <w:sz w:val="18"/>
+                <w:szCs w:val="18"/>
+              </w:rPr>
+            </w:pPr>
+            <w:r>
+              <w:rPr>
+                <w:sz w:val="18"/>
+                <w:szCs w:val="18"/>
+              </w:rPr>
+              <w:t>Minor</w:t>
+            </w:r>
+          </w:p>
+        </w:tc>
+        <w:tc>
+          <w:tcPr>
+            <w:tcW w:w="1278" w:type="dxa"/>
+            <w:vAlign w:val="center"/>
+          </w:tcPr>
+          <w:p>
+            <w:pPr>
+              <w:rPr>
+                <w:sz w:val="18"/>
+                <w:szCs w:val="18"/>
+              </w:rPr>
+            </w:pPr>
+            <w:r>
+              <w:rPr>
+                <w:sz w:val="18"/>
+                <w:szCs w:val="18"/>
+              </w:rPr>
+              <w:t>Team 1</w:t>
+            </w:r>
+          </w:p>
+        </w:tc>
+        <w:tc>
+          <w:tcPr>
+            <w:tcW w:w="1278" w:type="dxa"/>
+            <w:vAlign w:val="center"/>
+          </w:tcPr>
+          <w:p>
+            <w:pPr>
+              <w:rPr>
+                <w:sz w:val="18"/>
+                <w:szCs w:val="18"/>
+              </w:rPr>
+            </w:pPr>
+            <w:r>
+              <w:rPr>
+                <w:sz w:val="18"/>
+                <w:szCs w:val="18"/>
+              </w:rPr>
+              <w:t>Accept / Mitigate</w:t>
+            </w:r>
+          </w:p>
+        </w:tc>
+        <w:tc>
+          <w:tcPr>
+            <w:tcW w:w="1278" w:type="dxa"/>
+            <w:vAlign w:val="center"/>
+          </w:tcPr>
+          <w:p>
+            <w:pPr>
+              <w:rPr>
+                <w:sz w:val="18"/>
+                <w:szCs w:val="18"/>
+              </w:rPr>
+            </w:pPr>
+            <w:r>
+              <w:rPr>
+                <w:sz w:val="18"/>
+                <w:szCs w:val="18"/>
+              </w:rPr>
+              <w:t>Open - compare estimates with actual effort and adjust future sprints.</w:t>
+            </w:r>
+          </w:p>
+        </w:tc>
+      </w:tr>
+      <w:tr>
+        <w:trPr>
+          <w:cantSplit/>
+          <w:jc w:val="center"/>
+        </w:trPr>
+        <w:tc>
+          <w:tcPr>
+            <w:tcW w:w="1278" w:type="dxa"/>
+            <w:vAlign w:val="center"/>
+          </w:tcPr>
+          <w:p>
+            <w:pPr>
+              <w:rPr>
+                <w:sz w:val="18"/>
+                <w:szCs w:val="18"/>
+              </w:rPr>
+            </w:pPr>
+            <w:r>
+              <w:rPr>
+                <w:sz w:val="18"/>
+                <w:szCs w:val="18"/>
+              </w:rPr>
+              <w:t>R-09</w:t>
+            </w:r>
+          </w:p>
+        </w:tc>
+        <w:tc>
+          <w:tcPr>
+            <w:tcW w:w="1278" w:type="dxa"/>
+            <w:vAlign w:val="center"/>
+          </w:tcPr>
+          <w:p>
+            <w:pPr>
+              <w:rPr>
+                <w:sz w:val="18"/>
+                <w:szCs w:val="18"/>
+              </w:rPr>
+            </w:pPr>
+            <w:r>
+              <w:rPr>
+                <w:sz w:val="18"/>
+                <w:szCs w:val="18"/>
+              </w:rPr>
+              <w:t>Financial</w:t>
+            </w:r>
+          </w:p>
+        </w:tc>
+        <w:tc>
+          <w:tcPr>
+            <w:tcW w:w="1278" w:type="dxa"/>
+            <w:vAlign w:val="center"/>
+          </w:tcPr>
+          <w:p>
+            <w:pPr>
+              <w:rPr>
+                <w:sz w:val="18"/>
+                <w:szCs w:val="18"/>
+              </w:rPr>
+            </w:pPr>
+            <w:r>
+              <w:rPr>
+                <w:sz w:val="18"/>
+                <w:szCs w:val="18"/>
+              </w:rPr>
+              <w:t>Third-party service/API costs exceed estimates.</w:t>
+            </w:r>
+          </w:p>
+        </w:tc>
+        <w:tc>
+          <w:tcPr>
+            <w:tcW w:w="1278" w:type="dxa"/>
+            <w:vAlign w:val="center"/>
+          </w:tcPr>
+          <w:p>
+            <w:pPr>
+              <w:rPr>
+                <w:sz w:val="18"/>
+                <w:szCs w:val="18"/>
+              </w:rPr>
+            </w:pPr>
+            <w:r>
+              <w:rPr>
+                <w:sz w:val="18"/>
+                <w:szCs w:val="18"/>
+              </w:rPr>
+              <w:t>Low</w:t>
+            </w:r>
+          </w:p>
+        </w:tc>
+        <w:tc>
+          <w:tcPr>
+            <w:tcW w:w="1278" w:type="dxa"/>
+            <w:vAlign w:val="center"/>
+          </w:tcPr>
+          <w:p>
+            <w:pPr>
+              <w:rPr>
+                <w:sz w:val="18"/>
+                <w:szCs w:val="18"/>
+              </w:rPr>
+            </w:pPr>
+            <w:r>
+              <w:rPr>
+                <w:sz w:val="18"/>
+                <w:szCs w:val="18"/>
+              </w:rPr>
+              <w:t>Moderate</w:t>
+            </w:r>
+          </w:p>
+        </w:tc>
+        <w:tc>
+          <w:tcPr>
+            <w:tcW w:w="1278" w:type="dxa"/>
+            <w:vAlign w:val="center"/>
+          </w:tcPr>
+          <w:p>
+            <w:pPr>
+              <w:rPr>
+                <w:sz w:val="18"/>
+                <w:szCs w:val="18"/>
+              </w:rPr>
+            </w:pPr>
+            <w:r>
+              <w:rPr>
+                <w:sz w:val="18"/>
+                <w:szCs w:val="18"/>
+              </w:rPr>
+              <w:t>Project Manager</w:t>
+            </w:r>
+          </w:p>
+        </w:tc>
+        <w:tc>
+          <w:tcPr>
+            <w:tcW w:w="1278" w:type="dxa"/>
+            <w:vAlign w:val="center"/>
+          </w:tcPr>
+          <w:p>
+            <w:pPr>
+              <w:rPr>
+                <w:sz w:val="18"/>
+                <w:szCs w:val="18"/>
+              </w:rPr>
+            </w:pPr>
+            <w:r>
+              <w:rPr>
+                <w:sz w:val="18"/>
+                <w:szCs w:val="18"/>
+              </w:rPr>
+              <w:t>Mitigate</w:t>
+            </w:r>
+          </w:p>
+        </w:tc>
+        <w:tc>
+          <w:tcPr>
+            <w:tcW w:w="1278" w:type="dxa"/>
+            <w:vAlign w:val="center"/>
+          </w:tcPr>
+          <w:p>
+            <w:pPr>
+              <w:rPr>
+                <w:sz w:val="18"/>
+                <w:szCs w:val="18"/>
+              </w:rPr>
+            </w:pPr>
+            <w:r>
+              <w:rPr>
+                <w:sz w:val="18"/>
+                <w:szCs w:val="18"/>
+              </w:rPr>
+              <w:t>Open - monitor usage and review service pricing.</w:t>
+            </w:r>
+          </w:p>
+        </w:tc>
+      </w:tr>
+      <w:tr>
+        <w:trPr>
+          <w:cantSplit/>
+          <w:jc w:val="center"/>
+        </w:trPr>
+        <w:tc>
+          <w:tcPr>
+            <w:tcW w:w="1278" w:type="dxa"/>
+            <w:vAlign w:val="center"/>
+          </w:tcPr>
+          <w:p>
+            <w:pPr>
+              <w:rPr>
+                <w:sz w:val="18"/>
+                <w:szCs w:val="18"/>
+              </w:rPr>
+            </w:pPr>
+            <w:r>
+              <w:rPr>
+                <w:sz w:val="18"/>
+                <w:szCs w:val="18"/>
+              </w:rPr>
+              <w:t>R-10</w:t>
+            </w:r>
+          </w:p>
+        </w:tc>
+        <w:tc>
+          <w:tcPr>
+            <w:tcW w:w="1278" w:type="dxa"/>
+            <w:vAlign w:val="center"/>
+          </w:tcPr>
+          <w:p>
+            <w:pPr>
+              <w:rPr>
+                <w:sz w:val="18"/>
+                <w:szCs w:val="18"/>
+              </w:rPr>
+            </w:pPr>
+            <w:r>
+              <w:rPr>
+                <w:sz w:val="18"/>
+                <w:szCs w:val="18"/>
+              </w:rPr>
+              <w:t>Financial</w:t>
+            </w:r>
+          </w:p>
+        </w:tc>
+        <w:tc>
+          <w:tcPr>
+            <w:tcW w:w="1278" w:type="dxa"/>
+            <w:vAlign w:val="center"/>
+          </w:tcPr>
+          <w:p>
+            <w:pPr>
+              <w:rPr>
+                <w:sz w:val="18"/>
+                <w:szCs w:val="18"/>
+              </w:rPr>
+            </w:pPr>
+            <w:r>
+              <w:rPr>
+                <w:sz w:val="18"/>
+                <w:szCs w:val="18"/>
+              </w:rPr>
+              <w:t>Cloud/database costs exceed estimates.</w:t>
+            </w:r>
+          </w:p>
+        </w:tc>
+        <w:tc>
+          <w:tcPr>
+            <w:tcW w:w="1278" w:type="dxa"/>
+            <w:vAlign w:val="center"/>
+          </w:tcPr>
+          <w:p>
+            <w:pPr>
+              <w:rPr>
+                <w:sz w:val="18"/>
+                <w:szCs w:val="18"/>
+              </w:rPr>
+            </w:pPr>
+            <w:r>
+              <w:rPr>
+                <w:sz w:val="18"/>
+                <w:szCs w:val="18"/>
+              </w:rPr>
+              <w:t>Low</w:t>
+            </w:r>
+          </w:p>
+        </w:tc>
+        <w:tc>
+          <w:tcPr>
+            <w:tcW w:w="1278" w:type="dxa"/>
+            <w:vAlign w:val="center"/>
+          </w:tcPr>
+          <w:p>
+            <w:pPr>
+              <w:rPr>
+                <w:sz w:val="18"/>
+                <w:szCs w:val="18"/>
+              </w:rPr>
+            </w:pPr>
+            <w:r>
+              <w:rPr>
+                <w:sz w:val="18"/>
+                <w:szCs w:val="18"/>
+              </w:rPr>
+              <w:t>Moderate</w:t>
+            </w:r>
+          </w:p>
+        </w:tc>
+        <w:tc>
+          <w:tcPr>
+            <w:tcW w:w="1278" w:type="dxa"/>
+            <w:vAlign w:val="center"/>
+          </w:tcPr>
+          <w:p>
+            <w:pPr>
+              <w:rPr>
+                <w:sz w:val="18"/>
+                <w:szCs w:val="18"/>
+              </w:rPr>
+            </w:pPr>
+            <w:r>
+              <w:rPr>
+                <w:sz w:val="18"/>
+                <w:szCs w:val="18"/>
+              </w:rPr>
+              <w:t>Team 3</w:t>
+            </w:r>
+          </w:p>
+        </w:tc>
+        <w:tc>
+          <w:tcPr>
+            <w:tcW w:w="1278" w:type="dxa"/>
+            <w:vAlign w:val="center"/>
+          </w:tcPr>
+          <w:p>
+            <w:pPr>
+              <w:rPr>
+                <w:sz w:val="18"/>
+                <w:szCs w:val="18"/>
+              </w:rPr>
+            </w:pPr>
+            <w:r>
+              <w:rPr>
+                <w:sz w:val="18"/>
+                <w:szCs w:val="18"/>
+              </w:rPr>
+              <w:t>Mitigate</w:t>
+            </w:r>
+          </w:p>
+        </w:tc>
+        <w:tc>
+          <w:tcPr>
+            <w:tcW w:w="1278" w:type="dxa"/>
+            <w:vAlign w:val="center"/>
+          </w:tcPr>
+          <w:p>
+            <w:pPr>
+              <w:rPr>
+                <w:sz w:val="18"/>
+                <w:szCs w:val="18"/>
+              </w:rPr>
+            </w:pPr>
+            <w:r>
+              <w:rPr>
+                <w:sz w:val="18"/>
+                <w:szCs w:val="18"/>
+              </w:rPr>
+              <w:t>Open - monitor resource usage and optimize storage/requests.</w:t>
+            </w:r>
+          </w:p>
+        </w:tc>
+      </w:tr>
+      <w:tr>
+        <w:trPr>
+          <w:cantSplit/>
+          <w:jc w:val="center"/>
+        </w:trPr>
+        <w:tc>
+          <w:tcPr>
+            <w:tcW w:w="1278" w:type="dxa"/>
+            <w:vAlign w:val="center"/>
+          </w:tcPr>
+          <w:p>
+            <w:pPr>
+              <w:rPr>
+                <w:sz w:val="18"/>
+                <w:szCs w:val="18"/>
+              </w:rPr>
+            </w:pPr>
+            <w:r>
+              <w:rPr>
+                <w:sz w:val="18"/>
+                <w:szCs w:val="18"/>
+              </w:rPr>
+              <w:t>R-11</w:t>
+            </w:r>
+          </w:p>
+        </w:tc>
+        <w:tc>
+          <w:tcPr>
+            <w:tcW w:w="1278" w:type="dxa"/>
+            <w:vAlign w:val="center"/>
+          </w:tcPr>
+          <w:p>
+            <w:pPr>
+              <w:rPr>
+                <w:sz w:val="18"/>
+                <w:szCs w:val="18"/>
+              </w:rPr>
+            </w:pPr>
+            <w:r>
+              <w:rPr>
+                <w:sz w:val="18"/>
+                <w:szCs w:val="18"/>
+              </w:rPr>
+              <w:t>People</w:t>
+            </w:r>
+          </w:p>
+        </w:tc>
+        <w:tc>
+          <w:tcPr>
+            <w:tcW w:w="1278" w:type="dxa"/>
+            <w:vAlign w:val="center"/>
+          </w:tcPr>
+          <w:p>
+            <w:pPr>
+              <w:rPr>
+                <w:sz w:val="18"/>
+                <w:szCs w:val="18"/>
+              </w:rPr>
+            </w:pPr>
+            <w:r>
+              <w:rPr>
+                <w:sz w:val="18"/>
+                <w:szCs w:val="18"/>
+              </w:rPr>
+              <w:t>A team member becomes unavailable.</w:t>
+            </w:r>
+          </w:p>
+        </w:tc>
+        <w:tc>
+          <w:tcPr>
+            <w:tcW w:w="1278" w:type="dxa"/>
+            <w:vAlign w:val="center"/>
+          </w:tcPr>
+          <w:p>
+            <w:pPr>
+              <w:rPr>
+                <w:sz w:val="18"/>
+                <w:szCs w:val="18"/>
+              </w:rPr>
+            </w:pPr>
+            <w:r>
+              <w:rPr>
+                <w:sz w:val="18"/>
+                <w:szCs w:val="18"/>
+              </w:rPr>
+              <w:t>Low</w:t>
+            </w:r>
+          </w:p>
+        </w:tc>
+        <w:tc>
+          <w:tcPr>
+            <w:tcW w:w="1278" w:type="dxa"/>
+            <w:vAlign w:val="center"/>
+          </w:tcPr>
+          <w:p>
+            <w:pPr>
+              <w:rPr>
+                <w:sz w:val="18"/>
+                <w:szCs w:val="18"/>
+              </w:rPr>
+            </w:pPr>
+            <w:r>
+              <w:rPr>
+                <w:sz w:val="18"/>
+                <w:szCs w:val="18"/>
+              </w:rPr>
+              <w:t>Major</w:t>
+            </w:r>
+          </w:p>
+        </w:tc>
+        <w:tc>
+          <w:tcPr>
+            <w:tcW w:w="1278" w:type="dxa"/>
+            <w:vAlign w:val="center"/>
+          </w:tcPr>
+          <w:p>
+            <w:pPr>
+              <w:rPr>
+                <w:sz w:val="18"/>
+                <w:szCs w:val="18"/>
+              </w:rPr>
+            </w:pPr>
+            <w:r>
+              <w:rPr>
+                <w:sz w:val="18"/>
+                <w:szCs w:val="18"/>
+              </w:rPr>
+              <w:t>Project Manager</w:t>
+            </w:r>
+          </w:p>
+        </w:tc>
+        <w:tc>
+          <w:tcPr>
+            <w:tcW w:w="1278" w:type="dxa"/>
+            <w:vAlign w:val="center"/>
+          </w:tcPr>
+          <w:p>
+            <w:pPr>
+              <w:rPr>
+                <w:sz w:val="18"/>
+                <w:szCs w:val="18"/>
+              </w:rPr>
+            </w:pPr>
+            <w:r>
+              <w:rPr>
+                <w:sz w:val="18"/>
+                <w:szCs w:val="18"/>
+              </w:rPr>
+              <w:t>Mitigate</w:t>
+            </w:r>
+          </w:p>
+        </w:tc>
+        <w:tc>
+          <w:tcPr>
+            <w:tcW w:w="1278" w:type="dxa"/>
+            <w:vAlign w:val="center"/>
+          </w:tcPr>
+          <w:p>
+            <w:pPr>
+              <w:rPr>
+                <w:sz w:val="18"/>
+                <w:szCs w:val="18"/>
+              </w:rPr>
+            </w:pPr>
+            <w:r>
+              <w:rPr>
+                <w:sz w:val="18"/>
+                <w:szCs w:val="18"/>
+              </w:rPr>
+              <w:t>Open - document work and maintain shared project knowledge.</w:t>
+            </w:r>
+          </w:p>
+        </w:tc>
+      </w:tr>
+      <w:tr>
+        <w:trPr>
+          <w:cantSplit/>
+          <w:jc w:val="center"/>
+        </w:trPr>
+        <w:tc>
+          <w:tcPr>
+            <w:tcW w:w="1278" w:type="dxa"/>
+            <w:vAlign w:val="center"/>
+          </w:tcPr>
+          <w:p>
+            <w:pPr>
+              <w:rPr>
+                <w:sz w:val="18"/>
+                <w:szCs w:val="18"/>
+              </w:rPr>
+            </w:pPr>
+            <w:r>
+              <w:rPr>
+                <w:sz w:val="18"/>
+                <w:szCs w:val="18"/>
+              </w:rPr>
+              <w:t>R-12</w:t>
+            </w:r>
+          </w:p>
+        </w:tc>
+        <w:tc>
+          <w:tcPr>
+            <w:tcW w:w="1278" w:type="dxa"/>
+            <w:vAlign w:val="center"/>
+          </w:tcPr>
+          <w:p>
+            <w:pPr>
+              <w:rPr>
+                <w:sz w:val="18"/>
+                <w:szCs w:val="18"/>
+              </w:rPr>
+            </w:pPr>
+            <w:r>
+              <w:rPr>
+                <w:sz w:val="18"/>
+                <w:szCs w:val="18"/>
+              </w:rPr>
+              <w:t>People</w:t>
+            </w:r>
+          </w:p>
+        </w:tc>
+        <w:tc>
+          <w:tcPr>
+            <w:tcW w:w="1278" w:type="dxa"/>
+            <w:vAlign w:val="center"/>
+          </w:tcPr>
+          <w:p>
+            <w:pPr>
+              <w:rPr>
+                <w:sz w:val="18"/>
+                <w:szCs w:val="18"/>
+              </w:rPr>
+            </w:pPr>
+            <w:r>
+              <w:rPr>
+                <w:sz w:val="18"/>
+                <w:szCs w:val="18"/>
+              </w:rPr>
+              <w:t>Poor communication between teams causes rework.</w:t>
+            </w:r>
+          </w:p>
+        </w:tc>
+        <w:tc>
+          <w:tcPr>
+            <w:tcW w:w="1278" w:type="dxa"/>
+            <w:vAlign w:val="center"/>
+          </w:tcPr>
+          <w:p>
+            <w:pPr>
+              <w:rPr>
+                <w:sz w:val="18"/>
+                <w:szCs w:val="18"/>
+              </w:rPr>
+            </w:pPr>
+            <w:r>
+              <w:rPr>
+                <w:sz w:val="18"/>
+                <w:szCs w:val="18"/>
+              </w:rPr>
+              <w:t>Moderate</w:t>
+            </w:r>
+          </w:p>
+        </w:tc>
+        <w:tc>
+          <w:tcPr>
+            <w:tcW w:w="1278" w:type="dxa"/>
+            <w:vAlign w:val="center"/>
+          </w:tcPr>
+          <w:p>
+            <w:pPr>
+              <w:rPr>
+                <w:sz w:val="18"/>
+                <w:szCs w:val="18"/>
+              </w:rPr>
+            </w:pPr>
+            <w:r>
+              <w:rPr>
+                <w:sz w:val="18"/>
+                <w:szCs w:val="18"/>
+              </w:rPr>
+              <w:t>Moderate</w:t>
+            </w:r>
+          </w:p>
+        </w:tc>
+        <w:tc>
+          <w:tcPr>
+            <w:tcW w:w="1278" w:type="dxa"/>
+            <w:vAlign w:val="center"/>
+          </w:tcPr>
+          <w:p>
+            <w:pPr>
+              <w:rPr>
+                <w:sz w:val="18"/>
+                <w:szCs w:val="18"/>
+              </w:rPr>
+            </w:pPr>
+            <w:r>
+              <w:rPr>
+                <w:sz w:val="18"/>
+                <w:szCs w:val="18"/>
+              </w:rPr>
+              <w:t>All Teams</w:t>
+            </w:r>
+          </w:p>
+        </w:tc>
+        <w:tc>
+          <w:tcPr>
+            <w:tcW w:w="1278" w:type="dxa"/>
+            <w:vAlign w:val="center"/>
+          </w:tcPr>
+          <w:p>
+            <w:pPr>
+              <w:rPr>
+                <w:sz w:val="18"/>
+                <w:szCs w:val="18"/>
+              </w:rPr>
+            </w:pPr>
+            <w:r>
+              <w:rPr>
+                <w:sz w:val="18"/>
+                <w:szCs w:val="18"/>
+              </w:rPr>
+              <w:t>Mitigate</w:t>
+            </w:r>
+          </w:p>
+        </w:tc>
+        <w:tc>
+          <w:tcPr>
+            <w:tcW w:w="1278" w:type="dxa"/>
+            <w:vAlign w:val="center"/>
+          </w:tcPr>
+          <w:p>
+            <w:pPr>
+              <w:rPr>
+                <w:sz w:val="18"/>
+                <w:szCs w:val="18"/>
+              </w:rPr>
+            </w:pPr>
+            <w:r>
+              <w:rPr>
+                <w:sz w:val="18"/>
+                <w:szCs w:val="18"/>
+              </w:rPr>
+              <w:t>Open - use Jira and recurring cross-team status meetings.</w:t>
+            </w:r>
+          </w:p>
+        </w:tc>
+      </w:tr>
+    </w:tbl>
+    <w:p/>
+    <w:p>
+      <w:pPr>
+        <w:pStyle w:val="Heading1"/>
+      </w:pPr>
+      <w:r>
+        <w:lastRenderedPageBreak/>
+        <w:t>2. Communication Plan</w:t>
+      </w:r>
+    </w:p>
+    <w:p>
+      <w:r>
+        <w:t>The communication plan defines how the three project teams coordinate work, surface blockers, review risks, and report progress to stakeholders. Communication is tailored to the audience: development teams receive task-level information, while stakeholder updates focus on progress, risks, milestones, and next steps.</w:t>
+      </w:r>
+    </w:p>
+    <w:p>
+      <w:r>
+        <w:rPr>
+          <w:noProof/>
+        </w:rPr>
+        <w:drawing>
+          <wp:inline distT="0" distB="0" distL="0" distR="0" wp14:anchorId="45D20BBA" wp14:editId="05B8A8D3">
+            <wp:extent cx="6895042" cy="3878461"/>
+            <wp:effectExtent l="0" t="0" r="1270" b="8255"/>
+            <wp:docPr id="709879608" name="Graphic 1"/>
+            <wp:cNvGraphicFramePr>
+              <a:graphicFrameLocks xmlns:a="http://schemas.openxmlformats.org/drawingml/2006/main" noChangeAspect="1"/>
+            </wp:cNvGraphicFramePr>
+            <a:graphic xmlns:a="http://schemas.openxmlformats.org/drawingml/2006/main">
+              <a:graphicData uri="http://schemas.openxmlformats.org/drawingml/2006/picture">
+                <pic:pic xmlns:pic="http://schemas.openxmlformats.org/drawingml/2006/picture">
+                  <pic:nvPicPr>
+                    <pic:cNvPr id="709879608" name=""/>
+                    <pic:cNvPicPr/>
+                  </pic:nvPicPr>
+                  <pic:blipFill>
+                    <a:blip r:embed="rId14">
+                      <a:extLst>
+                        <a:ext uri="{96DAC541-7B7A-43D3-8B79-37D633B846F1}">
+                          <asvg:svgBlip xmlns:asvg="http://schemas.microsoft.com/office/drawing/2016/SVG/main" r:embed="rId15"/>
+                        </a:ext>
+                      </a:extLst>
+                    </a:blip>
+                    <a:stretch>
+                      <a:fillRect/>
+                    </a:stretch>
+                  </pic:blipFill>
+                  <pic:spPr>
+                    <a:xfrm>
+                      <a:off x="0" y="0"/>
+                      <a:ext cx="6903752" cy="3883361"/>
+                    </a:xfrm>
+                    <a:prstGeom prst="rect">
+                      <a:avLst/>
+                    </a:prstGeom>
+                  </pic:spPr>
+                </pic:pic>
+              </a:graphicData>
+            </a:graphic>
+          </wp:inline>
+        </w:drawing>
+      </w:r>
+    </w:p>
+    <w:p>
+      <w:pPr>
+        <w:pStyle w:val="Heading2"/>
+      </w:pPr>
+      <w:r>
+        <w:t>2.1 Reporting Methods</w:t>
+      </w:r>
+    </w:p>
+    <w:p>
+      <w:pPr>
+        <w:pStyle w:val="ListBullet"/>
+      </w:pPr>
+      <w:r>
+        <w:rPr>
+          <w:b/>
+        </w:rPr>
+        <w:t xml:space="preserve">Jira Scrum Board: </w:t>
+      </w:r>
+      <w:r>
+        <w:t>Tracks Sprint work through To Do, In Progress, and Done.</w:t>
+      </w:r>
+    </w:p>
+    <w:p>
+      <w:pPr>
+        <w:pStyle w:val="ListBullet"/>
+      </w:pPr>
+      <w:r>
+        <w:rPr>
+          <w:b/>
+        </w:rPr>
+        <w:t xml:space="preserve">Risk Register: </w:t>
+      </w:r>
+      <w:r>
+        <w:t>Tracks risk probability, impact, ownership, response strategy, and current status.</w:t>
+      </w:r>
+    </w:p>
+    <w:p>
+      <w:pPr>
+        <w:pStyle w:val="ListBullet"/>
+      </w:pPr>
+      <w:r>
+        <w:rPr>
+          <w:b/>
+        </w:rPr>
+        <w:t xml:space="preserve">Weekly Stakeholder Video: </w:t>
+      </w:r>
+      <w:r>
+        <w:t>Provides a concise summary of completed work, current risks, and upcoming work.</w:t>
+      </w:r>
+    </w:p>
+    <w:p>
+      <w:pPr>
+        <w:pStyle w:val="ListBullet"/>
+      </w:pPr>
+      <w:r>
+        <w:rPr>
+          <w:b/>
+        </w:rPr>
+        <w:t xml:space="preserve">Project Document: </w:t>
+      </w:r>
+      <w:r>
+        <w:t>Maintains the formal project record, including the WBS, Gantt chart, Scrum planning, risks, and communication plan.</w:t>
+      </w:r>
+    </w:p>
+    <w:p>
+      <w:pPr>
+        <w:pStyle w:val="Heading1"/>
+      </w:pPr>
+      <w:r>
+        <w:t>3. Weekly Review Approach</w:t>
+      </w:r>
+    </w:p>
+    <w:p>
+      <w:r>
+        <w:t>Risk and communication information will be reviewed as the project progresses. New risks will be added to the register, existing risks will be updated when probability or impact changes, and communication cadence may be adjusted if the needs of the project teams or stakeholders change.</w:t>
+      </w:r>
+    </w:p>
+    <w:p>
+      <w:pPr>
+        <w:rPr>
+          <w:iCs/>
+          <w:sz w:val="18"/>
+        </w:rPr>
+      </w:pPr>
     </w:p>
     <w:sectPr>
-      <w:headerReference w:type="default" r:id="rId14"/>
-      <w:footerReference w:type="default" r:id="rId15"/>
+      <w:headerReference w:type="default" r:id="rId16"/>
+      <w:footerReference w:type="default" r:id="rId17"/>
       <w:pgSz w:w="12240" w:h="15840"/>
       <w:pgMar w:top="1080" w:right="1224" w:bottom="1080" w:left="1224" w:header="720" w:footer="720" w:gutter="0"/>
       <w:cols w:space="720"/>

</xml_diff>